<commit_message>
feat: implement backend evaluation framework and initialize UI state management
</commit_message>
<xml_diff>
--- a/Dissertation-2024AA05522_FinalReport.docx
+++ b/Dissertation-2024AA05522_FinalReport.docx
@@ -878,7 +878,7 @@
           <w:szCs w:val="32"/>
         </w:rPr>
       </w:pPr>
-      <w:bookmarkStart w:id="0" w:name="_Toc235983524"/>
+      <w:bookmarkStart w:id="0" w:name="_Toc236342064"/>
       <w:r>
         <w:rPr>
           <w:sz w:val="32"/>
@@ -1815,7 +1815,7 @@
       </w:r>
     </w:p>
     <w:p>
-      <w:bookmarkStart w:id="1" w:name="_Toc235983525"/>
+      <w:bookmarkStart w:id="1" w:name="_Toc236342065"/>
       <w:r>
         <w:rPr>
           <w:rStyle w:val="Heading1Char"/>
@@ -2563,7 +2563,7 @@
           <w:r>
             <w:fldChar w:fldCharType="separate"/>
           </w:r>
-          <w:hyperlink w:anchor="_Toc235983524" w:history="1">
+          <w:hyperlink w:anchor="_Toc236342064" w:history="1">
             <w:r>
               <w:rPr>
                 <w:rStyle w:val="Hyperlink"/>
@@ -2590,7 +2590,7 @@
                 <w:noProof/>
                 <w:webHidden/>
               </w:rPr>
-              <w:instrText xml:space="preserve"> PAGEREF _Toc235983524 \h </w:instrText>
+              <w:instrText xml:space="preserve"> PAGEREF _Toc236342064 \h </w:instrText>
             </w:r>
             <w:r>
               <w:rPr>
@@ -2633,7 +2633,7 @@
               <w:lang w:val="en-US"/>
             </w:rPr>
           </w:pPr>
-          <w:hyperlink w:anchor="_Toc235983525" w:history="1">
+          <w:hyperlink w:anchor="_Toc236342065" w:history="1">
             <w:r>
               <w:rPr>
                 <w:rStyle w:val="Hyperlink"/>
@@ -2660,7 +2660,7 @@
                 <w:noProof/>
                 <w:webHidden/>
               </w:rPr>
-              <w:instrText xml:space="preserve"> PAGEREF _Toc235983525 \h </w:instrText>
+              <w:instrText xml:space="preserve"> PAGEREF _Toc236342065 \h </w:instrText>
             </w:r>
             <w:r>
               <w:rPr>
@@ -2703,7 +2703,7 @@
               <w:lang w:val="en-US"/>
             </w:rPr>
           </w:pPr>
-          <w:hyperlink w:anchor="_Toc235983526" w:history="1">
+          <w:hyperlink w:anchor="_Toc236342066" w:history="1">
             <w:r>
               <w:rPr>
                 <w:rStyle w:val="Hyperlink"/>
@@ -2730,7 +2730,7 @@
                 <w:noProof/>
                 <w:webHidden/>
               </w:rPr>
-              <w:instrText xml:space="preserve"> PAGEREF _Toc235983526 \h </w:instrText>
+              <w:instrText xml:space="preserve"> PAGEREF _Toc236342066 \h </w:instrText>
             </w:r>
             <w:r>
               <w:rPr>
@@ -2773,7 +2773,7 @@
               <w:lang w:val="en-US"/>
             </w:rPr>
           </w:pPr>
-          <w:hyperlink w:anchor="_Toc235983527" w:history="1">
+          <w:hyperlink w:anchor="_Toc236342067" w:history="1">
             <w:r>
               <w:rPr>
                 <w:rStyle w:val="Hyperlink"/>
@@ -2802,7 +2802,7 @@
                 <w:noProof/>
                 <w:webHidden/>
               </w:rPr>
-              <w:instrText xml:space="preserve"> PAGEREF _Toc235983527 \h </w:instrText>
+              <w:instrText xml:space="preserve"> PAGEREF _Toc236342067 \h </w:instrText>
             </w:r>
             <w:r>
               <w:rPr>
@@ -2845,7 +2845,7 @@
               <w:lang w:val="en-US"/>
             </w:rPr>
           </w:pPr>
-          <w:hyperlink w:anchor="_Toc235983528" w:history="1">
+          <w:hyperlink w:anchor="_Toc236342068" w:history="1">
             <w:r>
               <w:rPr>
                 <w:rStyle w:val="Hyperlink"/>
@@ -2874,7 +2874,7 @@
                 <w:noProof/>
                 <w:webHidden/>
               </w:rPr>
-              <w:instrText xml:space="preserve"> PAGEREF _Toc235983528 \h </w:instrText>
+              <w:instrText xml:space="preserve"> PAGEREF _Toc236342068 \h </w:instrText>
             </w:r>
             <w:r>
               <w:rPr>
@@ -2917,7 +2917,7 @@
               <w:lang w:val="en-US"/>
             </w:rPr>
           </w:pPr>
-          <w:hyperlink w:anchor="_Toc235983529" w:history="1">
+          <w:hyperlink w:anchor="_Toc236342069" w:history="1">
             <w:r>
               <w:rPr>
                 <w:rStyle w:val="Hyperlink"/>
@@ -2946,7 +2946,7 @@
                 <w:noProof/>
                 <w:webHidden/>
               </w:rPr>
-              <w:instrText xml:space="preserve"> PAGEREF _Toc235983529 \h </w:instrText>
+              <w:instrText xml:space="preserve"> PAGEREF _Toc236342069 \h </w:instrText>
             </w:r>
             <w:r>
               <w:rPr>
@@ -2989,7 +2989,7 @@
               <w:lang w:val="en-US"/>
             </w:rPr>
           </w:pPr>
-          <w:hyperlink w:anchor="_Toc235983530" w:history="1">
+          <w:hyperlink w:anchor="_Toc236342070" w:history="1">
             <w:r>
               <w:rPr>
                 <w:rStyle w:val="Hyperlink"/>
@@ -3018,7 +3018,7 @@
                 <w:noProof/>
                 <w:webHidden/>
               </w:rPr>
-              <w:instrText xml:space="preserve"> PAGEREF _Toc235983530 \h </w:instrText>
+              <w:instrText xml:space="preserve"> PAGEREF _Toc236342070 \h </w:instrText>
             </w:r>
             <w:r>
               <w:rPr>
@@ -3061,7 +3061,7 @@
               <w:lang w:val="en-US"/>
             </w:rPr>
           </w:pPr>
-          <w:hyperlink w:anchor="_Toc235983531" w:history="1">
+          <w:hyperlink w:anchor="_Toc236342071" w:history="1">
             <w:r>
               <w:rPr>
                 <w:rStyle w:val="Hyperlink"/>
@@ -3090,7 +3090,7 @@
                 <w:noProof/>
                 <w:webHidden/>
               </w:rPr>
-              <w:instrText xml:space="preserve"> PAGEREF _Toc235983531 \h </w:instrText>
+              <w:instrText xml:space="preserve"> PAGEREF _Toc236342071 \h </w:instrText>
             </w:r>
             <w:r>
               <w:rPr>
@@ -3133,7 +3133,7 @@
               <w:lang w:val="en-US"/>
             </w:rPr>
           </w:pPr>
-          <w:hyperlink w:anchor="_Toc235983532" w:history="1">
+          <w:hyperlink w:anchor="_Toc236342072" w:history="1">
             <w:r>
               <w:rPr>
                 <w:rStyle w:val="Hyperlink"/>
@@ -3162,7 +3162,7 @@
                 <w:noProof/>
                 <w:webHidden/>
               </w:rPr>
-              <w:instrText xml:space="preserve"> PAGEREF _Toc235983532 \h </w:instrText>
+              <w:instrText xml:space="preserve"> PAGEREF _Toc236342072 \h </w:instrText>
             </w:r>
             <w:r>
               <w:rPr>
@@ -3205,7 +3205,7 @@
               <w:lang w:val="en-US"/>
             </w:rPr>
           </w:pPr>
-          <w:hyperlink w:anchor="_Toc235983533" w:history="1">
+          <w:hyperlink w:anchor="_Toc236342073" w:history="1">
             <w:r>
               <w:rPr>
                 <w:rStyle w:val="Hyperlink"/>
@@ -3232,7 +3232,7 @@
                 <w:noProof/>
                 <w:webHidden/>
               </w:rPr>
-              <w:instrText xml:space="preserve"> PAGEREF _Toc235983533 \h </w:instrText>
+              <w:instrText xml:space="preserve"> PAGEREF _Toc236342073 \h </w:instrText>
             </w:r>
             <w:r>
               <w:rPr>
@@ -3275,7 +3275,7 @@
               <w:lang w:val="en-US"/>
             </w:rPr>
           </w:pPr>
-          <w:hyperlink w:anchor="_Toc235983534" w:history="1">
+          <w:hyperlink w:anchor="_Toc236342074" w:history="1">
             <w:r>
               <w:rPr>
                 <w:rStyle w:val="Hyperlink"/>
@@ -3304,7 +3304,7 @@
                 <w:noProof/>
                 <w:webHidden/>
               </w:rPr>
-              <w:instrText xml:space="preserve"> PAGEREF _Toc235983534 \h </w:instrText>
+              <w:instrText xml:space="preserve"> PAGEREF _Toc236342074 \h </w:instrText>
             </w:r>
             <w:r>
               <w:rPr>
@@ -3347,7 +3347,7 @@
               <w:lang w:val="en-US"/>
             </w:rPr>
           </w:pPr>
-          <w:hyperlink w:anchor="_Toc235983535" w:history="1">
+          <w:hyperlink w:anchor="_Toc236342075" w:history="1">
             <w:r>
               <w:rPr>
                 <w:rStyle w:val="Hyperlink"/>
@@ -3376,7 +3376,7 @@
                 <w:noProof/>
                 <w:webHidden/>
               </w:rPr>
-              <w:instrText xml:space="preserve"> PAGEREF _Toc235983535 \h </w:instrText>
+              <w:instrText xml:space="preserve"> PAGEREF _Toc236342075 \h </w:instrText>
             </w:r>
             <w:r>
               <w:rPr>
@@ -3419,7 +3419,7 @@
               <w:lang w:val="en-US"/>
             </w:rPr>
           </w:pPr>
-          <w:hyperlink w:anchor="_Toc235983536" w:history="1">
+          <w:hyperlink w:anchor="_Toc236342076" w:history="1">
             <w:r>
               <w:rPr>
                 <w:rStyle w:val="Hyperlink"/>
@@ -3448,7 +3448,7 @@
                 <w:noProof/>
                 <w:webHidden/>
               </w:rPr>
-              <w:instrText xml:space="preserve"> PAGEREF _Toc235983536 \h </w:instrText>
+              <w:instrText xml:space="preserve"> PAGEREF _Toc236342076 \h </w:instrText>
             </w:r>
             <w:r>
               <w:rPr>
@@ -3491,7 +3491,7 @@
               <w:lang w:val="en-US"/>
             </w:rPr>
           </w:pPr>
-          <w:hyperlink w:anchor="_Toc235983537" w:history="1">
+          <w:hyperlink w:anchor="_Toc236342077" w:history="1">
             <w:r>
               <w:rPr>
                 <w:rStyle w:val="Hyperlink"/>
@@ -3520,7 +3520,7 @@
                 <w:noProof/>
                 <w:webHidden/>
               </w:rPr>
-              <w:instrText xml:space="preserve"> PAGEREF _Toc235983537 \h </w:instrText>
+              <w:instrText xml:space="preserve"> PAGEREF _Toc236342077 \h </w:instrText>
             </w:r>
             <w:r>
               <w:rPr>
@@ -3563,7 +3563,7 @@
               <w:lang w:val="en-US"/>
             </w:rPr>
           </w:pPr>
-          <w:hyperlink w:anchor="_Toc235983538" w:history="1">
+          <w:hyperlink w:anchor="_Toc236342078" w:history="1">
             <w:r>
               <w:rPr>
                 <w:rStyle w:val="Hyperlink"/>
@@ -3592,7 +3592,7 @@
                 <w:noProof/>
                 <w:webHidden/>
               </w:rPr>
-              <w:instrText xml:space="preserve"> PAGEREF _Toc235983538 \h </w:instrText>
+              <w:instrText xml:space="preserve"> PAGEREF _Toc236342078 \h </w:instrText>
             </w:r>
             <w:r>
               <w:rPr>
@@ -3635,7 +3635,7 @@
               <w:lang w:val="en-US"/>
             </w:rPr>
           </w:pPr>
-          <w:hyperlink w:anchor="_Toc235983539" w:history="1">
+          <w:hyperlink w:anchor="_Toc236342079" w:history="1">
             <w:r>
               <w:rPr>
                 <w:rStyle w:val="Hyperlink"/>
@@ -3664,7 +3664,7 @@
                 <w:noProof/>
                 <w:webHidden/>
               </w:rPr>
-              <w:instrText xml:space="preserve"> PAGEREF _Toc235983539 \h </w:instrText>
+              <w:instrText xml:space="preserve"> PAGEREF _Toc236342079 \h </w:instrText>
             </w:r>
             <w:r>
               <w:rPr>
@@ -3707,7 +3707,7 @@
               <w:lang w:val="en-US"/>
             </w:rPr>
           </w:pPr>
-          <w:hyperlink w:anchor="_Toc235983540" w:history="1">
+          <w:hyperlink w:anchor="_Toc236342080" w:history="1">
             <w:r>
               <w:rPr>
                 <w:rStyle w:val="Hyperlink"/>
@@ -3736,7 +3736,7 @@
                 <w:noProof/>
                 <w:webHidden/>
               </w:rPr>
-              <w:instrText xml:space="preserve"> PAGEREF _Toc235983540 \h </w:instrText>
+              <w:instrText xml:space="preserve"> PAGEREF _Toc236342080 \h </w:instrText>
             </w:r>
             <w:r>
               <w:rPr>
@@ -3779,7 +3779,7 @@
               <w:lang w:val="en-US"/>
             </w:rPr>
           </w:pPr>
-          <w:hyperlink w:anchor="_Toc235983541" w:history="1">
+          <w:hyperlink w:anchor="_Toc236342081" w:history="1">
             <w:r>
               <w:rPr>
                 <w:rStyle w:val="Hyperlink"/>
@@ -3808,7 +3808,7 @@
                 <w:noProof/>
                 <w:webHidden/>
               </w:rPr>
-              <w:instrText xml:space="preserve"> PAGEREF _Toc235983541 \h </w:instrText>
+              <w:instrText xml:space="preserve"> PAGEREF _Toc236342081 \h </w:instrText>
             </w:r>
             <w:r>
               <w:rPr>
@@ -3851,7 +3851,7 @@
               <w:lang w:val="en-US"/>
             </w:rPr>
           </w:pPr>
-          <w:hyperlink w:anchor="_Toc235983542" w:history="1">
+          <w:hyperlink w:anchor="_Toc236342082" w:history="1">
             <w:r>
               <w:rPr>
                 <w:rStyle w:val="Hyperlink"/>
@@ -3880,7 +3880,7 @@
                 <w:noProof/>
                 <w:webHidden/>
               </w:rPr>
-              <w:instrText xml:space="preserve"> PAGEREF _Toc235983542 \h </w:instrText>
+              <w:instrText xml:space="preserve"> PAGEREF _Toc236342082 \h </w:instrText>
             </w:r>
             <w:r>
               <w:rPr>
@@ -3923,7 +3923,7 @@
               <w:lang w:val="en-US"/>
             </w:rPr>
           </w:pPr>
-          <w:hyperlink w:anchor="_Toc235983543" w:history="1">
+          <w:hyperlink w:anchor="_Toc236342083" w:history="1">
             <w:r>
               <w:rPr>
                 <w:rStyle w:val="Hyperlink"/>
@@ -3952,7 +3952,7 @@
                 <w:noProof/>
                 <w:webHidden/>
               </w:rPr>
-              <w:instrText xml:space="preserve"> PAGEREF _Toc235983543 \h </w:instrText>
+              <w:instrText xml:space="preserve"> PAGEREF _Toc236342083 \h </w:instrText>
             </w:r>
             <w:r>
               <w:rPr>
@@ -3995,7 +3995,7 @@
               <w:lang w:val="en-US"/>
             </w:rPr>
           </w:pPr>
-          <w:hyperlink w:anchor="_Toc235983544" w:history="1">
+          <w:hyperlink w:anchor="_Toc236342084" w:history="1">
             <w:r>
               <w:rPr>
                 <w:rStyle w:val="Hyperlink"/>
@@ -4024,7 +4024,7 @@
                 <w:noProof/>
                 <w:webHidden/>
               </w:rPr>
-              <w:instrText xml:space="preserve"> PAGEREF _Toc235983544 \h </w:instrText>
+              <w:instrText xml:space="preserve"> PAGEREF _Toc236342084 \h </w:instrText>
             </w:r>
             <w:r>
               <w:rPr>
@@ -4067,7 +4067,7 @@
               <w:lang w:val="en-US"/>
             </w:rPr>
           </w:pPr>
-          <w:hyperlink w:anchor="_Toc235983545" w:history="1">
+          <w:hyperlink w:anchor="_Toc236342085" w:history="1">
             <w:r>
               <w:rPr>
                 <w:rStyle w:val="Hyperlink"/>
@@ -4096,7 +4096,7 @@
                 <w:noProof/>
                 <w:webHidden/>
               </w:rPr>
-              <w:instrText xml:space="preserve"> PAGEREF _Toc235983545 \h </w:instrText>
+              <w:instrText xml:space="preserve"> PAGEREF _Toc236342085 \h </w:instrText>
             </w:r>
             <w:r>
               <w:rPr>
@@ -4139,7 +4139,7 @@
               <w:lang w:val="en-US"/>
             </w:rPr>
           </w:pPr>
-          <w:hyperlink w:anchor="_Toc235983546" w:history="1">
+          <w:hyperlink w:anchor="_Toc236342086" w:history="1">
             <w:r>
               <w:rPr>
                 <w:rStyle w:val="Hyperlink"/>
@@ -4168,7 +4168,7 @@
                 <w:noProof/>
                 <w:webHidden/>
               </w:rPr>
-              <w:instrText xml:space="preserve"> PAGEREF _Toc235983546 \h </w:instrText>
+              <w:instrText xml:space="preserve"> PAGEREF _Toc236342086 \h </w:instrText>
             </w:r>
             <w:r>
               <w:rPr>
@@ -4211,7 +4211,7 @@
               <w:lang w:val="en-US"/>
             </w:rPr>
           </w:pPr>
-          <w:hyperlink w:anchor="_Toc235983547" w:history="1">
+          <w:hyperlink w:anchor="_Toc236342087" w:history="1">
             <w:r>
               <w:rPr>
                 <w:rStyle w:val="Hyperlink"/>
@@ -4240,7 +4240,7 @@
                 <w:noProof/>
                 <w:webHidden/>
               </w:rPr>
-              <w:instrText xml:space="preserve"> PAGEREF _Toc235983547 \h </w:instrText>
+              <w:instrText xml:space="preserve"> PAGEREF _Toc236342087 \h </w:instrText>
             </w:r>
             <w:r>
               <w:rPr>
@@ -4283,7 +4283,7 @@
               <w:lang w:val="en-US"/>
             </w:rPr>
           </w:pPr>
-          <w:hyperlink w:anchor="_Toc235983548" w:history="1">
+          <w:hyperlink w:anchor="_Toc236342088" w:history="1">
             <w:r>
               <w:rPr>
                 <w:rStyle w:val="Hyperlink"/>
@@ -4312,7 +4312,7 @@
                 <w:noProof/>
                 <w:webHidden/>
               </w:rPr>
-              <w:instrText xml:space="preserve"> PAGEREF _Toc235983548 \h </w:instrText>
+              <w:instrText xml:space="preserve"> PAGEREF _Toc236342088 \h </w:instrText>
             </w:r>
             <w:r>
               <w:rPr>
@@ -4355,7 +4355,7 @@
               <w:lang w:val="en-US"/>
             </w:rPr>
           </w:pPr>
-          <w:hyperlink w:anchor="_Toc235983549" w:history="1">
+          <w:hyperlink w:anchor="_Toc236342089" w:history="1">
             <w:r>
               <w:rPr>
                 <w:rStyle w:val="Hyperlink"/>
@@ -4384,7 +4384,7 @@
                 <w:noProof/>
                 <w:webHidden/>
               </w:rPr>
-              <w:instrText xml:space="preserve"> PAGEREF _Toc235983549 \h </w:instrText>
+              <w:instrText xml:space="preserve"> PAGEREF _Toc236342089 \h </w:instrText>
             </w:r>
             <w:r>
               <w:rPr>
@@ -4427,7 +4427,7 @@
               <w:lang w:val="en-US"/>
             </w:rPr>
           </w:pPr>
-          <w:hyperlink w:anchor="_Toc235983550" w:history="1">
+          <w:hyperlink w:anchor="_Toc236342090" w:history="1">
             <w:r>
               <w:rPr>
                 <w:rStyle w:val="Hyperlink"/>
@@ -4456,7 +4456,7 @@
                 <w:noProof/>
                 <w:webHidden/>
               </w:rPr>
-              <w:instrText xml:space="preserve"> PAGEREF _Toc235983550 \h </w:instrText>
+              <w:instrText xml:space="preserve"> PAGEREF _Toc236342090 \h </w:instrText>
             </w:r>
             <w:r>
               <w:rPr>
@@ -4499,7 +4499,7 @@
               <w:lang w:val="en-US"/>
             </w:rPr>
           </w:pPr>
-          <w:hyperlink w:anchor="_Toc235983551" w:history="1">
+          <w:hyperlink w:anchor="_Toc236342091" w:history="1">
             <w:r>
               <w:rPr>
                 <w:rStyle w:val="Hyperlink"/>
@@ -4528,7 +4528,7 @@
                 <w:noProof/>
                 <w:webHidden/>
               </w:rPr>
-              <w:instrText xml:space="preserve"> PAGEREF _Toc235983551 \h </w:instrText>
+              <w:instrText xml:space="preserve"> PAGEREF _Toc236342091 \h </w:instrText>
             </w:r>
             <w:r>
               <w:rPr>
@@ -4571,7 +4571,7 @@
               <w:lang w:val="en-US"/>
             </w:rPr>
           </w:pPr>
-          <w:hyperlink w:anchor="_Toc235983552" w:history="1">
+          <w:hyperlink w:anchor="_Toc236342092" w:history="1">
             <w:r>
               <w:rPr>
                 <w:rStyle w:val="Hyperlink"/>
@@ -4600,7 +4600,7 @@
                 <w:noProof/>
                 <w:webHidden/>
               </w:rPr>
-              <w:instrText xml:space="preserve"> PAGEREF _Toc235983552 \h </w:instrText>
+              <w:instrText xml:space="preserve"> PAGEREF _Toc236342092 \h </w:instrText>
             </w:r>
             <w:r>
               <w:rPr>
@@ -4643,7 +4643,7 @@
               <w:lang w:val="en-US"/>
             </w:rPr>
           </w:pPr>
-          <w:hyperlink w:anchor="_Toc235983553" w:history="1">
+          <w:hyperlink w:anchor="_Toc236342093" w:history="1">
             <w:r>
               <w:rPr>
                 <w:rStyle w:val="Hyperlink"/>
@@ -4672,7 +4672,7 @@
                 <w:noProof/>
                 <w:webHidden/>
               </w:rPr>
-              <w:instrText xml:space="preserve"> PAGEREF _Toc235983553 \h </w:instrText>
+              <w:instrText xml:space="preserve"> PAGEREF _Toc236342093 \h </w:instrText>
             </w:r>
             <w:r>
               <w:rPr>
@@ -4715,7 +4715,7 @@
               <w:lang w:val="en-US"/>
             </w:rPr>
           </w:pPr>
-          <w:hyperlink w:anchor="_Toc235983554" w:history="1">
+          <w:hyperlink w:anchor="_Toc236342094" w:history="1">
             <w:r>
               <w:rPr>
                 <w:rStyle w:val="Hyperlink"/>
@@ -4744,7 +4744,7 @@
                 <w:noProof/>
                 <w:webHidden/>
               </w:rPr>
-              <w:instrText xml:space="preserve"> PAGEREF _Toc235983554 \h </w:instrText>
+              <w:instrText xml:space="preserve"> PAGEREF _Toc236342094 \h </w:instrText>
             </w:r>
             <w:r>
               <w:rPr>
@@ -4787,7 +4787,7 @@
               <w:lang w:val="en-US"/>
             </w:rPr>
           </w:pPr>
-          <w:hyperlink w:anchor="_Toc235983555" w:history="1">
+          <w:hyperlink w:anchor="_Toc236342095" w:history="1">
             <w:r>
               <w:rPr>
                 <w:rStyle w:val="Hyperlink"/>
@@ -4816,7 +4816,7 @@
                 <w:noProof/>
                 <w:webHidden/>
               </w:rPr>
-              <w:instrText xml:space="preserve"> PAGEREF _Toc235983555 \h </w:instrText>
+              <w:instrText xml:space="preserve"> PAGEREF _Toc236342095 \h </w:instrText>
             </w:r>
             <w:r>
               <w:rPr>
@@ -4859,7 +4859,7 @@
               <w:lang w:val="en-US"/>
             </w:rPr>
           </w:pPr>
-          <w:hyperlink w:anchor="_Toc235983556" w:history="1">
+          <w:hyperlink w:anchor="_Toc236342096" w:history="1">
             <w:r>
               <w:rPr>
                 <w:rStyle w:val="Hyperlink"/>
@@ -4888,7 +4888,7 @@
                 <w:noProof/>
                 <w:webHidden/>
               </w:rPr>
-              <w:instrText xml:space="preserve"> PAGEREF _Toc235983556 \h </w:instrText>
+              <w:instrText xml:space="preserve"> PAGEREF _Toc236342096 \h </w:instrText>
             </w:r>
             <w:r>
               <w:rPr>
@@ -4931,7 +4931,7 @@
               <w:lang w:val="en-US"/>
             </w:rPr>
           </w:pPr>
-          <w:hyperlink w:anchor="_Toc235983557" w:history="1">
+          <w:hyperlink w:anchor="_Toc236342097" w:history="1">
             <w:r>
               <w:rPr>
                 <w:rStyle w:val="Hyperlink"/>
@@ -4960,7 +4960,7 @@
                 <w:noProof/>
                 <w:webHidden/>
               </w:rPr>
-              <w:instrText xml:space="preserve"> PAGEREF _Toc235983557 \h </w:instrText>
+              <w:instrText xml:space="preserve"> PAGEREF _Toc236342097 \h </w:instrText>
             </w:r>
             <w:r>
               <w:rPr>
@@ -5003,7 +5003,7 @@
               <w:lang w:val="en-US"/>
             </w:rPr>
           </w:pPr>
-          <w:hyperlink w:anchor="_Toc235983558" w:history="1">
+          <w:hyperlink w:anchor="_Toc236342098" w:history="1">
             <w:r>
               <w:rPr>
                 <w:rStyle w:val="Hyperlink"/>
@@ -5032,7 +5032,7 @@
                 <w:noProof/>
                 <w:webHidden/>
               </w:rPr>
-              <w:instrText xml:space="preserve"> PAGEREF _Toc235983558 \h </w:instrText>
+              <w:instrText xml:space="preserve"> PAGEREF _Toc236342098 \h </w:instrText>
             </w:r>
             <w:r>
               <w:rPr>
@@ -5075,7 +5075,7 @@
               <w:lang w:val="en-US"/>
             </w:rPr>
           </w:pPr>
-          <w:hyperlink w:anchor="_Toc235983559" w:history="1">
+          <w:hyperlink w:anchor="_Toc236342099" w:history="1">
             <w:r>
               <w:rPr>
                 <w:rStyle w:val="Hyperlink"/>
@@ -5104,7 +5104,7 @@
                 <w:noProof/>
                 <w:webHidden/>
               </w:rPr>
-              <w:instrText xml:space="preserve"> PAGEREF _Toc235983559 \h </w:instrText>
+              <w:instrText xml:space="preserve"> PAGEREF _Toc236342099 \h </w:instrText>
             </w:r>
             <w:r>
               <w:rPr>
@@ -5147,7 +5147,7 @@
               <w:lang w:val="en-US"/>
             </w:rPr>
           </w:pPr>
-          <w:hyperlink w:anchor="_Toc235983560" w:history="1">
+          <w:hyperlink w:anchor="_Toc236342100" w:history="1">
             <w:r>
               <w:rPr>
                 <w:rStyle w:val="Hyperlink"/>
@@ -5176,7 +5176,7 @@
                 <w:noProof/>
                 <w:webHidden/>
               </w:rPr>
-              <w:instrText xml:space="preserve"> PAGEREF _Toc235983560 \h </w:instrText>
+              <w:instrText xml:space="preserve"> PAGEREF _Toc236342100 \h </w:instrText>
             </w:r>
             <w:r>
               <w:rPr>
@@ -5219,7 +5219,7 @@
               <w:lang w:val="en-US"/>
             </w:rPr>
           </w:pPr>
-          <w:hyperlink w:anchor="_Toc235983561" w:history="1">
+          <w:hyperlink w:anchor="_Toc236342101" w:history="1">
             <w:r>
               <w:rPr>
                 <w:rStyle w:val="Hyperlink"/>
@@ -5248,7 +5248,7 @@
                 <w:noProof/>
                 <w:webHidden/>
               </w:rPr>
-              <w:instrText xml:space="preserve"> PAGEREF _Toc235983561 \h </w:instrText>
+              <w:instrText xml:space="preserve"> PAGEREF _Toc236342101 \h </w:instrText>
             </w:r>
             <w:r>
               <w:rPr>
@@ -5291,7 +5291,7 @@
               <w:lang w:val="en-US"/>
             </w:rPr>
           </w:pPr>
-          <w:hyperlink w:anchor="_Toc235983562" w:history="1">
+          <w:hyperlink w:anchor="_Toc236342102" w:history="1">
             <w:r>
               <w:rPr>
                 <w:rStyle w:val="Hyperlink"/>
@@ -5320,7 +5320,7 @@
                 <w:noProof/>
                 <w:webHidden/>
               </w:rPr>
-              <w:instrText xml:space="preserve"> PAGEREF _Toc235983562 \h </w:instrText>
+              <w:instrText xml:space="preserve"> PAGEREF _Toc236342102 \h </w:instrText>
             </w:r>
             <w:r>
               <w:rPr>
@@ -5363,7 +5363,7 @@
               <w:lang w:val="en-US"/>
             </w:rPr>
           </w:pPr>
-          <w:hyperlink w:anchor="_Toc235983563" w:history="1">
+          <w:hyperlink w:anchor="_Toc236342103" w:history="1">
             <w:r>
               <w:rPr>
                 <w:rStyle w:val="Hyperlink"/>
@@ -5392,7 +5392,7 @@
                 <w:noProof/>
                 <w:webHidden/>
               </w:rPr>
-              <w:instrText xml:space="preserve"> PAGEREF _Toc235983563 \h </w:instrText>
+              <w:instrText xml:space="preserve"> PAGEREF _Toc236342103 \h </w:instrText>
             </w:r>
             <w:r>
               <w:rPr>
@@ -5435,7 +5435,7 @@
               <w:lang w:val="en-US"/>
             </w:rPr>
           </w:pPr>
-          <w:hyperlink w:anchor="_Toc235983564" w:history="1">
+          <w:hyperlink w:anchor="_Toc236342104" w:history="1">
             <w:r>
               <w:rPr>
                 <w:rStyle w:val="Hyperlink"/>
@@ -5464,7 +5464,7 @@
                 <w:noProof/>
                 <w:webHidden/>
               </w:rPr>
-              <w:instrText xml:space="preserve"> PAGEREF _Toc235983564 \h </w:instrText>
+              <w:instrText xml:space="preserve"> PAGEREF _Toc236342104 \h </w:instrText>
             </w:r>
             <w:r>
               <w:rPr>
@@ -5507,7 +5507,7 @@
               <w:lang w:val="en-US"/>
             </w:rPr>
           </w:pPr>
-          <w:hyperlink w:anchor="_Toc235983565" w:history="1">
+          <w:hyperlink w:anchor="_Toc236342105" w:history="1">
             <w:r>
               <w:rPr>
                 <w:rStyle w:val="Hyperlink"/>
@@ -5536,7 +5536,7 @@
                 <w:noProof/>
                 <w:webHidden/>
               </w:rPr>
-              <w:instrText xml:space="preserve"> PAGEREF _Toc235983565 \h </w:instrText>
+              <w:instrText xml:space="preserve"> PAGEREF _Toc236342105 \h </w:instrText>
             </w:r>
             <w:r>
               <w:rPr>
@@ -5579,7 +5579,7 @@
               <w:lang w:val="en-US"/>
             </w:rPr>
           </w:pPr>
-          <w:hyperlink w:anchor="_Toc235983566" w:history="1">
+          <w:hyperlink w:anchor="_Toc236342106" w:history="1">
             <w:r>
               <w:rPr>
                 <w:rStyle w:val="Hyperlink"/>
@@ -5608,7 +5608,7 @@
                 <w:noProof/>
                 <w:webHidden/>
               </w:rPr>
-              <w:instrText xml:space="preserve"> PAGEREF _Toc235983566 \h </w:instrText>
+              <w:instrText xml:space="preserve"> PAGEREF _Toc236342106 \h </w:instrText>
             </w:r>
             <w:r>
               <w:rPr>
@@ -5651,7 +5651,7 @@
               <w:lang w:val="en-US"/>
             </w:rPr>
           </w:pPr>
-          <w:hyperlink w:anchor="_Toc235983567" w:history="1">
+          <w:hyperlink w:anchor="_Toc236342107" w:history="1">
             <w:r>
               <w:rPr>
                 <w:rStyle w:val="Hyperlink"/>
@@ -5680,7 +5680,7 @@
                 <w:noProof/>
                 <w:webHidden/>
               </w:rPr>
-              <w:instrText xml:space="preserve"> PAGEREF _Toc235983567 \h </w:instrText>
+              <w:instrText xml:space="preserve"> PAGEREF _Toc236342107 \h </w:instrText>
             </w:r>
             <w:r>
               <w:rPr>
@@ -5723,7 +5723,7 @@
               <w:lang w:val="en-US"/>
             </w:rPr>
           </w:pPr>
-          <w:hyperlink w:anchor="_Toc235983568" w:history="1">
+          <w:hyperlink w:anchor="_Toc236342108" w:history="1">
             <w:r>
               <w:rPr>
                 <w:rStyle w:val="Hyperlink"/>
@@ -5752,7 +5752,7 @@
                 <w:noProof/>
                 <w:webHidden/>
               </w:rPr>
-              <w:instrText xml:space="preserve"> PAGEREF _Toc235983568 \h </w:instrText>
+              <w:instrText xml:space="preserve"> PAGEREF _Toc236342108 \h </w:instrText>
             </w:r>
             <w:r>
               <w:rPr>
@@ -5795,7 +5795,7 @@
               <w:lang w:val="en-US"/>
             </w:rPr>
           </w:pPr>
-          <w:hyperlink w:anchor="_Toc235983569" w:history="1">
+          <w:hyperlink w:anchor="_Toc236342109" w:history="1">
             <w:r>
               <w:rPr>
                 <w:rStyle w:val="Hyperlink"/>
@@ -5824,7 +5824,7 @@
                 <w:noProof/>
                 <w:webHidden/>
               </w:rPr>
-              <w:instrText xml:space="preserve"> PAGEREF _Toc235983569 \h </w:instrText>
+              <w:instrText xml:space="preserve"> PAGEREF _Toc236342109 \h </w:instrText>
             </w:r>
             <w:r>
               <w:rPr>
@@ -5867,7 +5867,7 @@
               <w:lang w:val="en-US"/>
             </w:rPr>
           </w:pPr>
-          <w:hyperlink w:anchor="_Toc235983570" w:history="1">
+          <w:hyperlink w:anchor="_Toc236342110" w:history="1">
             <w:r>
               <w:rPr>
                 <w:rStyle w:val="Hyperlink"/>
@@ -5896,7 +5896,7 @@
                 <w:noProof/>
                 <w:webHidden/>
               </w:rPr>
-              <w:instrText xml:space="preserve"> PAGEREF _Toc235983570 \h </w:instrText>
+              <w:instrText xml:space="preserve"> PAGEREF _Toc236342110 \h </w:instrText>
             </w:r>
             <w:r>
               <w:rPr>
@@ -5939,7 +5939,7 @@
               <w:lang w:val="en-US"/>
             </w:rPr>
           </w:pPr>
-          <w:hyperlink w:anchor="_Toc235983571" w:history="1">
+          <w:hyperlink w:anchor="_Toc236342111" w:history="1">
             <w:r>
               <w:rPr>
                 <w:rStyle w:val="Hyperlink"/>
@@ -5968,7 +5968,7 @@
                 <w:noProof/>
                 <w:webHidden/>
               </w:rPr>
-              <w:instrText xml:space="preserve"> PAGEREF _Toc235983571 \h </w:instrText>
+              <w:instrText xml:space="preserve"> PAGEREF _Toc236342111 \h </w:instrText>
             </w:r>
             <w:r>
               <w:rPr>
@@ -6011,7 +6011,7 @@
               <w:lang w:val="en-US"/>
             </w:rPr>
           </w:pPr>
-          <w:hyperlink w:anchor="_Toc235983572" w:history="1">
+          <w:hyperlink w:anchor="_Toc236342112" w:history="1">
             <w:r>
               <w:rPr>
                 <w:rStyle w:val="Hyperlink"/>
@@ -6040,7 +6040,7 @@
                 <w:noProof/>
                 <w:webHidden/>
               </w:rPr>
-              <w:instrText xml:space="preserve"> PAGEREF _Toc235983572 \h </w:instrText>
+              <w:instrText xml:space="preserve"> PAGEREF _Toc236342112 \h </w:instrText>
             </w:r>
             <w:r>
               <w:rPr>
@@ -6083,7 +6083,7 @@
               <w:lang w:val="en-US"/>
             </w:rPr>
           </w:pPr>
-          <w:hyperlink w:anchor="_Toc235983573" w:history="1">
+          <w:hyperlink w:anchor="_Toc236342113" w:history="1">
             <w:r>
               <w:rPr>
                 <w:rStyle w:val="Hyperlink"/>
@@ -6112,7 +6112,7 @@
                 <w:noProof/>
                 <w:webHidden/>
               </w:rPr>
-              <w:instrText xml:space="preserve"> PAGEREF _Toc235983573 \h </w:instrText>
+              <w:instrText xml:space="preserve"> PAGEREF _Toc236342113 \h </w:instrText>
             </w:r>
             <w:r>
               <w:rPr>
@@ -6155,7 +6155,7 @@
               <w:lang w:val="en-US"/>
             </w:rPr>
           </w:pPr>
-          <w:hyperlink w:anchor="_Toc235983574" w:history="1">
+          <w:hyperlink w:anchor="_Toc236342114" w:history="1">
             <w:r>
               <w:rPr>
                 <w:rStyle w:val="Hyperlink"/>
@@ -6184,7 +6184,7 @@
                 <w:noProof/>
                 <w:webHidden/>
               </w:rPr>
-              <w:instrText xml:space="preserve"> PAGEREF _Toc235983574 \h </w:instrText>
+              <w:instrText xml:space="preserve"> PAGEREF _Toc236342114 \h </w:instrText>
             </w:r>
             <w:r>
               <w:rPr>
@@ -6227,7 +6227,7 @@
               <w:lang w:val="en-US"/>
             </w:rPr>
           </w:pPr>
-          <w:hyperlink w:anchor="_Toc235983575" w:history="1">
+          <w:hyperlink w:anchor="_Toc236342115" w:history="1">
             <w:r>
               <w:rPr>
                 <w:rStyle w:val="Hyperlink"/>
@@ -6255,7 +6255,7 @@
                 <w:noProof/>
                 <w:webHidden/>
               </w:rPr>
-              <w:instrText xml:space="preserve"> PAGEREF _Toc235983575 \h </w:instrText>
+              <w:instrText xml:space="preserve"> PAGEREF _Toc236342115 \h </w:instrText>
             </w:r>
             <w:r>
               <w:rPr>
@@ -6298,7 +6298,7 @@
               <w:lang w:val="en-US"/>
             </w:rPr>
           </w:pPr>
-          <w:hyperlink w:anchor="_Toc235983576" w:history="1">
+          <w:hyperlink w:anchor="_Toc236342116" w:history="1">
             <w:r>
               <w:rPr>
                 <w:rStyle w:val="Hyperlink"/>
@@ -6327,7 +6327,7 @@
                 <w:noProof/>
                 <w:webHidden/>
               </w:rPr>
-              <w:instrText xml:space="preserve"> PAGEREF _Toc235983576 \h </w:instrText>
+              <w:instrText xml:space="preserve"> PAGEREF _Toc236342116 \h </w:instrText>
             </w:r>
             <w:r>
               <w:rPr>
@@ -6370,7 +6370,7 @@
               <w:lang w:val="en-US"/>
             </w:rPr>
           </w:pPr>
-          <w:hyperlink w:anchor="_Toc235983577" w:history="1">
+          <w:hyperlink w:anchor="_Toc236342117" w:history="1">
             <w:r>
               <w:rPr>
                 <w:rStyle w:val="Hyperlink"/>
@@ -6397,7 +6397,7 @@
                 <w:noProof/>
                 <w:webHidden/>
               </w:rPr>
-              <w:instrText xml:space="preserve"> PAGEREF _Toc235983577 \h </w:instrText>
+              <w:instrText xml:space="preserve"> PAGEREF _Toc236342117 \h </w:instrText>
             </w:r>
             <w:r>
               <w:rPr>
@@ -6440,7 +6440,7 @@
               <w:lang w:val="en-US"/>
             </w:rPr>
           </w:pPr>
-          <w:hyperlink w:anchor="_Toc235983578" w:history="1">
+          <w:hyperlink w:anchor="_Toc236342118" w:history="1">
             <w:r>
               <w:rPr>
                 <w:rStyle w:val="Hyperlink"/>
@@ -6469,7 +6469,7 @@
                 <w:noProof/>
                 <w:webHidden/>
               </w:rPr>
-              <w:instrText xml:space="preserve"> PAGEREF _Toc235983578 \h </w:instrText>
+              <w:instrText xml:space="preserve"> PAGEREF _Toc236342118 \h </w:instrText>
             </w:r>
             <w:r>
               <w:rPr>
@@ -6512,7 +6512,7 @@
               <w:lang w:val="en-US"/>
             </w:rPr>
           </w:pPr>
-          <w:hyperlink w:anchor="_Toc235983579" w:history="1">
+          <w:hyperlink w:anchor="_Toc236342119" w:history="1">
             <w:r>
               <w:rPr>
                 <w:rStyle w:val="Hyperlink"/>
@@ -6541,7 +6541,7 @@
                 <w:noProof/>
                 <w:webHidden/>
               </w:rPr>
-              <w:instrText xml:space="preserve"> PAGEREF _Toc235983579 \h </w:instrText>
+              <w:instrText xml:space="preserve"> PAGEREF _Toc236342119 \h </w:instrText>
             </w:r>
             <w:r>
               <w:rPr>
@@ -6584,7 +6584,7 @@
               <w:lang w:val="en-US"/>
             </w:rPr>
           </w:pPr>
-          <w:hyperlink w:anchor="_Toc235983580" w:history="1">
+          <w:hyperlink w:anchor="_Toc236342120" w:history="1">
             <w:r>
               <w:rPr>
                 <w:rStyle w:val="Hyperlink"/>
@@ -6613,7 +6613,7 @@
                 <w:noProof/>
                 <w:webHidden/>
               </w:rPr>
-              <w:instrText xml:space="preserve"> PAGEREF _Toc235983580 \h </w:instrText>
+              <w:instrText xml:space="preserve"> PAGEREF _Toc236342120 \h </w:instrText>
             </w:r>
             <w:r>
               <w:rPr>
@@ -6656,7 +6656,7 @@
               <w:lang w:val="en-US"/>
             </w:rPr>
           </w:pPr>
-          <w:hyperlink w:anchor="_Toc235983581" w:history="1">
+          <w:hyperlink w:anchor="_Toc236342121" w:history="1">
             <w:r>
               <w:rPr>
                 <w:rStyle w:val="Hyperlink"/>
@@ -6685,7 +6685,7 @@
                 <w:noProof/>
                 <w:webHidden/>
               </w:rPr>
-              <w:instrText xml:space="preserve"> PAGEREF _Toc235983581 \h </w:instrText>
+              <w:instrText xml:space="preserve"> PAGEREF _Toc236342121 \h </w:instrText>
             </w:r>
             <w:r>
               <w:rPr>
@@ -6728,7 +6728,7 @@
               <w:lang w:val="en-US"/>
             </w:rPr>
           </w:pPr>
-          <w:hyperlink w:anchor="_Toc235983582" w:history="1">
+          <w:hyperlink w:anchor="_Toc236342122" w:history="1">
             <w:r>
               <w:rPr>
                 <w:rStyle w:val="Hyperlink"/>
@@ -6757,7 +6757,7 @@
                 <w:noProof/>
                 <w:webHidden/>
               </w:rPr>
-              <w:instrText xml:space="preserve"> PAGEREF _Toc235983582 \h </w:instrText>
+              <w:instrText xml:space="preserve"> PAGEREF _Toc236342122 \h </w:instrText>
             </w:r>
             <w:r>
               <w:rPr>
@@ -6800,7 +6800,7 @@
               <w:lang w:val="en-US"/>
             </w:rPr>
           </w:pPr>
-          <w:hyperlink w:anchor="_Toc235983583" w:history="1">
+          <w:hyperlink w:anchor="_Toc236342123" w:history="1">
             <w:r>
               <w:rPr>
                 <w:rStyle w:val="Hyperlink"/>
@@ -6829,7 +6829,7 @@
                 <w:noProof/>
                 <w:webHidden/>
               </w:rPr>
-              <w:instrText xml:space="preserve"> PAGEREF _Toc235983583 \h </w:instrText>
+              <w:instrText xml:space="preserve"> PAGEREF _Toc236342123 \h </w:instrText>
             </w:r>
             <w:r>
               <w:rPr>
@@ -6872,7 +6872,7 @@
               <w:lang w:val="en-US"/>
             </w:rPr>
           </w:pPr>
-          <w:hyperlink w:anchor="_Toc235983584" w:history="1">
+          <w:hyperlink w:anchor="_Toc236342124" w:history="1">
             <w:r>
               <w:rPr>
                 <w:rStyle w:val="Hyperlink"/>
@@ -6901,7 +6901,7 @@
                 <w:noProof/>
                 <w:webHidden/>
               </w:rPr>
-              <w:instrText xml:space="preserve"> PAGEREF _Toc235983584 \h </w:instrText>
+              <w:instrText xml:space="preserve"> PAGEREF _Toc236342124 \h </w:instrText>
             </w:r>
             <w:r>
               <w:rPr>
@@ -6944,7 +6944,7 @@
               <w:lang w:val="en-US"/>
             </w:rPr>
           </w:pPr>
-          <w:hyperlink w:anchor="_Toc235983585" w:history="1">
+          <w:hyperlink w:anchor="_Toc236342125" w:history="1">
             <w:r>
               <w:rPr>
                 <w:rStyle w:val="Hyperlink"/>
@@ -6973,7 +6973,7 @@
                 <w:noProof/>
                 <w:webHidden/>
               </w:rPr>
-              <w:instrText xml:space="preserve"> PAGEREF _Toc235983585 \h </w:instrText>
+              <w:instrText xml:space="preserve"> PAGEREF _Toc236342125 \h </w:instrText>
             </w:r>
             <w:r>
               <w:rPr>
@@ -7016,7 +7016,7 @@
               <w:lang w:val="en-US"/>
             </w:rPr>
           </w:pPr>
-          <w:hyperlink w:anchor="_Toc235983586" w:history="1">
+          <w:hyperlink w:anchor="_Toc236342126" w:history="1">
             <w:r>
               <w:rPr>
                 <w:rStyle w:val="Hyperlink"/>
@@ -7045,7 +7045,7 @@
                 <w:noProof/>
                 <w:webHidden/>
               </w:rPr>
-              <w:instrText xml:space="preserve"> PAGEREF _Toc235983586 \h </w:instrText>
+              <w:instrText xml:space="preserve"> PAGEREF _Toc236342126 \h </w:instrText>
             </w:r>
             <w:r>
               <w:rPr>
@@ -7088,7 +7088,7 @@
               <w:lang w:val="en-US"/>
             </w:rPr>
           </w:pPr>
-          <w:hyperlink w:anchor="_Toc235983587" w:history="1">
+          <w:hyperlink w:anchor="_Toc236342127" w:history="1">
             <w:r>
               <w:rPr>
                 <w:rStyle w:val="Hyperlink"/>
@@ -7116,7 +7116,7 @@
                 <w:noProof/>
                 <w:webHidden/>
               </w:rPr>
-              <w:instrText xml:space="preserve"> PAGEREF _Toc235983587 \h </w:instrText>
+              <w:instrText xml:space="preserve"> PAGEREF _Toc236342127 \h </w:instrText>
             </w:r>
             <w:r>
               <w:rPr>
@@ -7159,7 +7159,7 @@
               <w:lang w:val="en-US"/>
             </w:rPr>
           </w:pPr>
-          <w:hyperlink w:anchor="_Toc235983588" w:history="1">
+          <w:hyperlink w:anchor="_Toc236342128" w:history="1">
             <w:r>
               <w:rPr>
                 <w:rStyle w:val="Hyperlink"/>
@@ -7188,7 +7188,7 @@
                 <w:noProof/>
                 <w:webHidden/>
               </w:rPr>
-              <w:instrText xml:space="preserve"> PAGEREF _Toc235983588 \h </w:instrText>
+              <w:instrText xml:space="preserve"> PAGEREF _Toc236342128 \h </w:instrText>
             </w:r>
             <w:r>
               <w:rPr>
@@ -7231,7 +7231,7 @@
               <w:lang w:val="en-US"/>
             </w:rPr>
           </w:pPr>
-          <w:hyperlink w:anchor="_Toc235983589" w:history="1">
+          <w:hyperlink w:anchor="_Toc236342129" w:history="1">
             <w:r>
               <w:rPr>
                 <w:rStyle w:val="Hyperlink"/>
@@ -7260,7 +7260,7 @@
                 <w:noProof/>
                 <w:webHidden/>
               </w:rPr>
-              <w:instrText xml:space="preserve"> PAGEREF _Toc235983589 \h </w:instrText>
+              <w:instrText xml:space="preserve"> PAGEREF _Toc236342129 \h </w:instrText>
             </w:r>
             <w:r>
               <w:rPr>
@@ -7303,7 +7303,7 @@
               <w:lang w:val="en-US"/>
             </w:rPr>
           </w:pPr>
-          <w:hyperlink w:anchor="_Toc235983590" w:history="1">
+          <w:hyperlink w:anchor="_Toc236342130" w:history="1">
             <w:r>
               <w:rPr>
                 <w:rStyle w:val="Hyperlink"/>
@@ -7332,7 +7332,7 @@
                 <w:noProof/>
                 <w:webHidden/>
               </w:rPr>
-              <w:instrText xml:space="preserve"> PAGEREF _Toc235983590 \h </w:instrText>
+              <w:instrText xml:space="preserve"> PAGEREF _Toc236342130 \h </w:instrText>
             </w:r>
             <w:r>
               <w:rPr>
@@ -7375,7 +7375,7 @@
               <w:lang w:val="en-US"/>
             </w:rPr>
           </w:pPr>
-          <w:hyperlink w:anchor="_Toc235983591" w:history="1">
+          <w:hyperlink w:anchor="_Toc236342131" w:history="1">
             <w:r>
               <w:rPr>
                 <w:rStyle w:val="Hyperlink"/>
@@ -7403,7 +7403,7 @@
                 <w:noProof/>
                 <w:webHidden/>
               </w:rPr>
-              <w:instrText xml:space="preserve"> PAGEREF _Toc235983591 \h </w:instrText>
+              <w:instrText xml:space="preserve"> PAGEREF _Toc236342131 \h </w:instrText>
             </w:r>
             <w:r>
               <w:rPr>
@@ -7446,7 +7446,7 @@
               <w:lang w:val="en-US"/>
             </w:rPr>
           </w:pPr>
-          <w:hyperlink w:anchor="_Toc235983592" w:history="1">
+          <w:hyperlink w:anchor="_Toc236342132" w:history="1">
             <w:r>
               <w:rPr>
                 <w:rStyle w:val="Hyperlink"/>
@@ -7475,7 +7475,7 @@
                 <w:noProof/>
                 <w:webHidden/>
               </w:rPr>
-              <w:instrText xml:space="preserve"> PAGEREF _Toc235983592 \h </w:instrText>
+              <w:instrText xml:space="preserve"> PAGEREF _Toc236342132 \h </w:instrText>
             </w:r>
             <w:r>
               <w:rPr>
@@ -7518,7 +7518,7 @@
               <w:lang w:val="en-US"/>
             </w:rPr>
           </w:pPr>
-          <w:hyperlink w:anchor="_Toc235983593" w:history="1">
+          <w:hyperlink w:anchor="_Toc236342133" w:history="1">
             <w:r>
               <w:rPr>
                 <w:rStyle w:val="Hyperlink"/>
@@ -7547,7 +7547,7 @@
                 <w:noProof/>
                 <w:webHidden/>
               </w:rPr>
-              <w:instrText xml:space="preserve"> PAGEREF _Toc235983593 \h </w:instrText>
+              <w:instrText xml:space="preserve"> PAGEREF _Toc236342133 \h </w:instrText>
             </w:r>
             <w:r>
               <w:rPr>
@@ -7590,7 +7590,7 @@
               <w:lang w:val="en-US"/>
             </w:rPr>
           </w:pPr>
-          <w:hyperlink w:anchor="_Toc235983594" w:history="1">
+          <w:hyperlink w:anchor="_Toc236342134" w:history="1">
             <w:r>
               <w:rPr>
                 <w:rStyle w:val="Hyperlink"/>
@@ -7618,7 +7618,7 @@
                 <w:noProof/>
                 <w:webHidden/>
               </w:rPr>
-              <w:instrText xml:space="preserve"> PAGEREF _Toc235983594 \h </w:instrText>
+              <w:instrText xml:space="preserve"> PAGEREF _Toc236342134 \h </w:instrText>
             </w:r>
             <w:r>
               <w:rPr>
@@ -7661,7 +7661,7 @@
               <w:lang w:val="en-US"/>
             </w:rPr>
           </w:pPr>
-          <w:hyperlink w:anchor="_Toc235983595" w:history="1">
+          <w:hyperlink w:anchor="_Toc236342135" w:history="1">
             <w:r>
               <w:rPr>
                 <w:rStyle w:val="Hyperlink"/>
@@ -7690,7 +7690,7 @@
                 <w:noProof/>
                 <w:webHidden/>
               </w:rPr>
-              <w:instrText xml:space="preserve"> PAGEREF _Toc235983595 \h </w:instrText>
+              <w:instrText xml:space="preserve"> PAGEREF _Toc236342135 \h </w:instrText>
             </w:r>
             <w:r>
               <w:rPr>
@@ -7733,7 +7733,7 @@
               <w:lang w:val="en-US"/>
             </w:rPr>
           </w:pPr>
-          <w:hyperlink w:anchor="_Toc235983596" w:history="1">
+          <w:hyperlink w:anchor="_Toc236342136" w:history="1">
             <w:r>
               <w:rPr>
                 <w:rStyle w:val="Hyperlink"/>
@@ -7762,7 +7762,7 @@
                 <w:noProof/>
                 <w:webHidden/>
               </w:rPr>
-              <w:instrText xml:space="preserve"> PAGEREF _Toc235983596 \h </w:instrText>
+              <w:instrText xml:space="preserve"> PAGEREF _Toc236342136 \h </w:instrText>
             </w:r>
             <w:r>
               <w:rPr>
@@ -7805,7 +7805,7 @@
               <w:lang w:val="en-US"/>
             </w:rPr>
           </w:pPr>
-          <w:hyperlink w:anchor="_Toc235983597" w:history="1">
+          <w:hyperlink w:anchor="_Toc236342137" w:history="1">
             <w:r>
               <w:rPr>
                 <w:rStyle w:val="Hyperlink"/>
@@ -7834,7 +7834,7 @@
                 <w:noProof/>
                 <w:webHidden/>
               </w:rPr>
-              <w:instrText xml:space="preserve"> PAGEREF _Toc235983597 \h </w:instrText>
+              <w:instrText xml:space="preserve"> PAGEREF _Toc236342137 \h </w:instrText>
             </w:r>
             <w:r>
               <w:rPr>
@@ -7877,7 +7877,7 @@
               <w:lang w:val="en-US"/>
             </w:rPr>
           </w:pPr>
-          <w:hyperlink w:anchor="_Toc235983598" w:history="1">
+          <w:hyperlink w:anchor="_Toc236342138" w:history="1">
             <w:r>
               <w:rPr>
                 <w:rStyle w:val="Hyperlink"/>
@@ -7906,7 +7906,7 @@
                 <w:noProof/>
                 <w:webHidden/>
               </w:rPr>
-              <w:instrText xml:space="preserve"> PAGEREF _Toc235983598 \h </w:instrText>
+              <w:instrText xml:space="preserve"> PAGEREF _Toc236342138 \h </w:instrText>
             </w:r>
             <w:r>
               <w:rPr>
@@ -7949,7 +7949,7 @@
               <w:lang w:val="en-US"/>
             </w:rPr>
           </w:pPr>
-          <w:hyperlink w:anchor="_Toc235983599" w:history="1">
+          <w:hyperlink w:anchor="_Toc236342139" w:history="1">
             <w:r>
               <w:rPr>
                 <w:rStyle w:val="Hyperlink"/>
@@ -7978,7 +7978,7 @@
                 <w:noProof/>
                 <w:webHidden/>
               </w:rPr>
-              <w:instrText xml:space="preserve"> PAGEREF _Toc235983599 \h </w:instrText>
+              <w:instrText xml:space="preserve"> PAGEREF _Toc236342139 \h </w:instrText>
             </w:r>
             <w:r>
               <w:rPr>
@@ -8021,7 +8021,7 @@
               <w:lang w:val="en-US"/>
             </w:rPr>
           </w:pPr>
-          <w:hyperlink w:anchor="_Toc235983600" w:history="1">
+          <w:hyperlink w:anchor="_Toc236342140" w:history="1">
             <w:r>
               <w:rPr>
                 <w:rStyle w:val="Hyperlink"/>
@@ -8050,7 +8050,7 @@
                 <w:noProof/>
                 <w:webHidden/>
               </w:rPr>
-              <w:instrText xml:space="preserve"> PAGEREF _Toc235983600 \h </w:instrText>
+              <w:instrText xml:space="preserve"> PAGEREF _Toc236342140 \h </w:instrText>
             </w:r>
             <w:r>
               <w:rPr>
@@ -8093,7 +8093,7 @@
               <w:lang w:val="en-US"/>
             </w:rPr>
           </w:pPr>
-          <w:hyperlink w:anchor="_Toc235983601" w:history="1">
+          <w:hyperlink w:anchor="_Toc236342141" w:history="1">
             <w:r>
               <w:rPr>
                 <w:rStyle w:val="Hyperlink"/>
@@ -8122,7 +8122,7 @@
                 <w:noProof/>
                 <w:webHidden/>
               </w:rPr>
-              <w:instrText xml:space="preserve"> PAGEREF _Toc235983601 \h </w:instrText>
+              <w:instrText xml:space="preserve"> PAGEREF _Toc236342141 \h </w:instrText>
             </w:r>
             <w:r>
               <w:rPr>
@@ -8165,7 +8165,7 @@
               <w:lang w:val="en-US"/>
             </w:rPr>
           </w:pPr>
-          <w:hyperlink w:anchor="_Toc235983602" w:history="1">
+          <w:hyperlink w:anchor="_Toc236342142" w:history="1">
             <w:r>
               <w:rPr>
                 <w:rStyle w:val="Hyperlink"/>
@@ -8193,7 +8193,7 @@
                 <w:noProof/>
                 <w:webHidden/>
               </w:rPr>
-              <w:instrText xml:space="preserve"> PAGEREF _Toc235983602 \h </w:instrText>
+              <w:instrText xml:space="preserve"> PAGEREF _Toc236342142 \h </w:instrText>
             </w:r>
             <w:r>
               <w:rPr>
@@ -8236,7 +8236,7 @@
               <w:lang w:val="en-US"/>
             </w:rPr>
           </w:pPr>
-          <w:hyperlink w:anchor="_Toc235983603" w:history="1">
+          <w:hyperlink w:anchor="_Toc236342143" w:history="1">
             <w:r>
               <w:rPr>
                 <w:rStyle w:val="Hyperlink"/>
@@ -8265,7 +8265,7 @@
                 <w:noProof/>
                 <w:webHidden/>
               </w:rPr>
-              <w:instrText xml:space="preserve"> PAGEREF _Toc235983603 \h </w:instrText>
+              <w:instrText xml:space="preserve"> PAGEREF _Toc236342143 \h </w:instrText>
             </w:r>
             <w:r>
               <w:rPr>
@@ -8308,7 +8308,7 @@
               <w:lang w:val="en-US"/>
             </w:rPr>
           </w:pPr>
-          <w:hyperlink w:anchor="_Toc235983604" w:history="1">
+          <w:hyperlink w:anchor="_Toc236342144" w:history="1">
             <w:r>
               <w:rPr>
                 <w:rStyle w:val="Hyperlink"/>
@@ -8337,7 +8337,7 @@
                 <w:noProof/>
                 <w:webHidden/>
               </w:rPr>
-              <w:instrText xml:space="preserve"> PAGEREF _Toc235983604 \h </w:instrText>
+              <w:instrText xml:space="preserve"> PAGEREF _Toc236342144 \h </w:instrText>
             </w:r>
             <w:r>
               <w:rPr>
@@ -8380,7 +8380,7 @@
               <w:lang w:val="en-US"/>
             </w:rPr>
           </w:pPr>
-          <w:hyperlink w:anchor="_Toc235983605" w:history="1">
+          <w:hyperlink w:anchor="_Toc236342145" w:history="1">
             <w:r>
               <w:rPr>
                 <w:rStyle w:val="Hyperlink"/>
@@ -8409,7 +8409,7 @@
                 <w:noProof/>
                 <w:webHidden/>
               </w:rPr>
-              <w:instrText xml:space="preserve"> PAGEREF _Toc235983605 \h </w:instrText>
+              <w:instrText xml:space="preserve"> PAGEREF _Toc236342145 \h </w:instrText>
             </w:r>
             <w:r>
               <w:rPr>
@@ -8452,7 +8452,7 @@
               <w:lang w:val="en-US"/>
             </w:rPr>
           </w:pPr>
-          <w:hyperlink w:anchor="_Toc235983606" w:history="1">
+          <w:hyperlink w:anchor="_Toc236342146" w:history="1">
             <w:r>
               <w:rPr>
                 <w:rStyle w:val="Hyperlink"/>
@@ -8480,7 +8480,7 @@
                 <w:noProof/>
                 <w:webHidden/>
               </w:rPr>
-              <w:instrText xml:space="preserve"> PAGEREF _Toc235983606 \h </w:instrText>
+              <w:instrText xml:space="preserve"> PAGEREF _Toc236342146 \h </w:instrText>
             </w:r>
             <w:r>
               <w:rPr>
@@ -8523,7 +8523,7 @@
               <w:lang w:val="en-US"/>
             </w:rPr>
           </w:pPr>
-          <w:hyperlink w:anchor="_Toc235983607" w:history="1">
+          <w:hyperlink w:anchor="_Toc236342147" w:history="1">
             <w:r>
               <w:rPr>
                 <w:rStyle w:val="Hyperlink"/>
@@ -8552,7 +8552,7 @@
                 <w:noProof/>
                 <w:webHidden/>
               </w:rPr>
-              <w:instrText xml:space="preserve"> PAGEREF _Toc235983607 \h </w:instrText>
+              <w:instrText xml:space="preserve"> PAGEREF _Toc236342147 \h </w:instrText>
             </w:r>
             <w:r>
               <w:rPr>
@@ -8595,7 +8595,7 @@
               <w:lang w:val="en-US"/>
             </w:rPr>
           </w:pPr>
-          <w:hyperlink w:anchor="_Toc235983608" w:history="1">
+          <w:hyperlink w:anchor="_Toc236342148" w:history="1">
             <w:r>
               <w:rPr>
                 <w:rStyle w:val="Hyperlink"/>
@@ -8624,7 +8624,7 @@
                 <w:noProof/>
                 <w:webHidden/>
               </w:rPr>
-              <w:instrText xml:space="preserve"> PAGEREF _Toc235983608 \h </w:instrText>
+              <w:instrText xml:space="preserve"> PAGEREF _Toc236342148 \h </w:instrText>
             </w:r>
             <w:r>
               <w:rPr>
@@ -8667,7 +8667,7 @@
               <w:lang w:val="en-US"/>
             </w:rPr>
           </w:pPr>
-          <w:hyperlink w:anchor="_Toc235983609" w:history="1">
+          <w:hyperlink w:anchor="_Toc236342149" w:history="1">
             <w:r>
               <w:rPr>
                 <w:rStyle w:val="Hyperlink"/>
@@ -8696,7 +8696,7 @@
                 <w:noProof/>
                 <w:webHidden/>
               </w:rPr>
-              <w:instrText xml:space="preserve"> PAGEREF _Toc235983609 \h </w:instrText>
+              <w:instrText xml:space="preserve"> PAGEREF _Toc236342149 \h </w:instrText>
             </w:r>
             <w:r>
               <w:rPr>
@@ -8739,7 +8739,7 @@
               <w:lang w:val="en-US"/>
             </w:rPr>
           </w:pPr>
-          <w:hyperlink w:anchor="_Toc235983610" w:history="1">
+          <w:hyperlink w:anchor="_Toc236342150" w:history="1">
             <w:r>
               <w:rPr>
                 <w:rStyle w:val="Hyperlink"/>
@@ -8768,7 +8768,7 @@
                 <w:noProof/>
                 <w:webHidden/>
               </w:rPr>
-              <w:instrText xml:space="preserve"> PAGEREF _Toc235983610 \h </w:instrText>
+              <w:instrText xml:space="preserve"> PAGEREF _Toc236342150 \h </w:instrText>
             </w:r>
             <w:r>
               <w:rPr>
@@ -8811,7 +8811,7 @@
               <w:lang w:val="en-US"/>
             </w:rPr>
           </w:pPr>
-          <w:hyperlink w:anchor="_Toc235983611" w:history="1">
+          <w:hyperlink w:anchor="_Toc236342151" w:history="1">
             <w:r>
               <w:rPr>
                 <w:rStyle w:val="Hyperlink"/>
@@ -8850,7 +8850,7 @@
                 <w:noProof/>
                 <w:webHidden/>
               </w:rPr>
-              <w:instrText xml:space="preserve"> PAGEREF _Toc235983611 \h </w:instrText>
+              <w:instrText xml:space="preserve"> PAGEREF _Toc236342151 \h </w:instrText>
             </w:r>
             <w:r>
               <w:rPr>
@@ -8893,7 +8893,7 @@
               <w:lang w:val="en-US"/>
             </w:rPr>
           </w:pPr>
-          <w:hyperlink w:anchor="_Toc235983612" w:history="1">
+          <w:hyperlink w:anchor="_Toc236342152" w:history="1">
             <w:r>
               <w:rPr>
                 <w:rStyle w:val="Hyperlink"/>
@@ -8922,7 +8922,7 @@
                 <w:noProof/>
                 <w:webHidden/>
               </w:rPr>
-              <w:instrText xml:space="preserve"> PAGEREF _Toc235983612 \h </w:instrText>
+              <w:instrText xml:space="preserve"> PAGEREF _Toc236342152 \h </w:instrText>
             </w:r>
             <w:r>
               <w:rPr>
@@ -8965,7 +8965,7 @@
               <w:lang w:val="en-US"/>
             </w:rPr>
           </w:pPr>
-          <w:hyperlink w:anchor="_Toc235983613" w:history="1">
+          <w:hyperlink w:anchor="_Toc236342153" w:history="1">
             <w:r>
               <w:rPr>
                 <w:rStyle w:val="Hyperlink"/>
@@ -8994,7 +8994,7 @@
                 <w:noProof/>
                 <w:webHidden/>
               </w:rPr>
-              <w:instrText xml:space="preserve"> PAGEREF _Toc235983613 \h </w:instrText>
+              <w:instrText xml:space="preserve"> PAGEREF _Toc236342153 \h </w:instrText>
             </w:r>
             <w:r>
               <w:rPr>
@@ -9037,7 +9037,7 @@
               <w:lang w:val="en-US"/>
             </w:rPr>
           </w:pPr>
-          <w:hyperlink w:anchor="_Toc235983614" w:history="1">
+          <w:hyperlink w:anchor="_Toc236342154" w:history="1">
             <w:r>
               <w:rPr>
                 <w:rStyle w:val="Hyperlink"/>
@@ -9076,7 +9076,7 @@
                 <w:noProof/>
                 <w:webHidden/>
               </w:rPr>
-              <w:instrText xml:space="preserve"> PAGEREF _Toc235983614 \h </w:instrText>
+              <w:instrText xml:space="preserve"> PAGEREF _Toc236342154 \h </w:instrText>
             </w:r>
             <w:r>
               <w:rPr>
@@ -9119,7 +9119,7 @@
               <w:lang w:val="en-US"/>
             </w:rPr>
           </w:pPr>
-          <w:hyperlink w:anchor="_Toc235983615" w:history="1">
+          <w:hyperlink w:anchor="_Toc236342155" w:history="1">
             <w:r>
               <w:rPr>
                 <w:rStyle w:val="Hyperlink"/>
@@ -9148,7 +9148,7 @@
                 <w:noProof/>
                 <w:webHidden/>
               </w:rPr>
-              <w:instrText xml:space="preserve"> PAGEREF _Toc235983615 \h </w:instrText>
+              <w:instrText xml:space="preserve"> PAGEREF _Toc236342155 \h </w:instrText>
             </w:r>
             <w:r>
               <w:rPr>
@@ -9191,7 +9191,7 @@
               <w:lang w:val="en-US"/>
             </w:rPr>
           </w:pPr>
-          <w:hyperlink w:anchor="_Toc235983616" w:history="1">
+          <w:hyperlink w:anchor="_Toc236342156" w:history="1">
             <w:r>
               <w:rPr>
                 <w:rStyle w:val="Hyperlink"/>
@@ -9220,7 +9220,7 @@
                 <w:noProof/>
                 <w:webHidden/>
               </w:rPr>
-              <w:instrText xml:space="preserve"> PAGEREF _Toc235983616 \h </w:instrText>
+              <w:instrText xml:space="preserve"> PAGEREF _Toc236342156 \h </w:instrText>
             </w:r>
             <w:r>
               <w:rPr>
@@ -9263,7 +9263,7 @@
               <w:lang w:val="en-US"/>
             </w:rPr>
           </w:pPr>
-          <w:hyperlink w:anchor="_Toc235983617" w:history="1">
+          <w:hyperlink w:anchor="_Toc236342157" w:history="1">
             <w:r>
               <w:rPr>
                 <w:rStyle w:val="Hyperlink"/>
@@ -9292,7 +9292,7 @@
                 <w:noProof/>
                 <w:webHidden/>
               </w:rPr>
-              <w:instrText xml:space="preserve"> PAGEREF _Toc235983617 \h </w:instrText>
+              <w:instrText xml:space="preserve"> PAGEREF _Toc236342157 \h </w:instrText>
             </w:r>
             <w:r>
               <w:rPr>
@@ -9335,7 +9335,7 @@
               <w:lang w:val="en-US"/>
             </w:rPr>
           </w:pPr>
-          <w:hyperlink w:anchor="_Toc235983618" w:history="1">
+          <w:hyperlink w:anchor="_Toc236342158" w:history="1">
             <w:r>
               <w:rPr>
                 <w:rStyle w:val="Hyperlink"/>
@@ -9364,7 +9364,7 @@
                 <w:noProof/>
                 <w:webHidden/>
               </w:rPr>
-              <w:instrText xml:space="preserve"> PAGEREF _Toc235983618 \h </w:instrText>
+              <w:instrText xml:space="preserve"> PAGEREF _Toc236342158 \h </w:instrText>
             </w:r>
             <w:r>
               <w:rPr>
@@ -9407,7 +9407,7 @@
               <w:lang w:val="en-US"/>
             </w:rPr>
           </w:pPr>
-          <w:hyperlink w:anchor="_Toc235983619" w:history="1">
+          <w:hyperlink w:anchor="_Toc236342159" w:history="1">
             <w:r>
               <w:rPr>
                 <w:rStyle w:val="Hyperlink"/>
@@ -9434,7 +9434,7 @@
                 <w:noProof/>
                 <w:webHidden/>
               </w:rPr>
-              <w:instrText xml:space="preserve"> PAGEREF _Toc235983619 \h </w:instrText>
+              <w:instrText xml:space="preserve"> PAGEREF _Toc236342159 \h </w:instrText>
             </w:r>
             <w:r>
               <w:rPr>
@@ -9477,7 +9477,7 @@
               <w:lang w:val="en-US"/>
             </w:rPr>
           </w:pPr>
-          <w:hyperlink w:anchor="_Toc235983620" w:history="1">
+          <w:hyperlink w:anchor="_Toc236342160" w:history="1">
             <w:r>
               <w:rPr>
                 <w:rStyle w:val="Hyperlink"/>
@@ -9506,7 +9506,7 @@
                 <w:noProof/>
                 <w:webHidden/>
               </w:rPr>
-              <w:instrText xml:space="preserve"> PAGEREF _Toc235983620 \h </w:instrText>
+              <w:instrText xml:space="preserve"> PAGEREF _Toc236342160 \h </w:instrText>
             </w:r>
             <w:r>
               <w:rPr>
@@ -9549,7 +9549,7 @@
               <w:lang w:val="en-US"/>
             </w:rPr>
           </w:pPr>
-          <w:hyperlink w:anchor="_Toc235983621" w:history="1">
+          <w:hyperlink w:anchor="_Toc236342161" w:history="1">
             <w:r>
               <w:rPr>
                 <w:rStyle w:val="Hyperlink"/>
@@ -9578,7 +9578,7 @@
                 <w:noProof/>
                 <w:webHidden/>
               </w:rPr>
-              <w:instrText xml:space="preserve"> PAGEREF _Toc235983621 \h </w:instrText>
+              <w:instrText xml:space="preserve"> PAGEREF _Toc236342161 \h </w:instrText>
             </w:r>
             <w:r>
               <w:rPr>
@@ -9621,7 +9621,7 @@
               <w:lang w:val="en-US"/>
             </w:rPr>
           </w:pPr>
-          <w:hyperlink w:anchor="_Toc235983622" w:history="1">
+          <w:hyperlink w:anchor="_Toc236342162" w:history="1">
             <w:r>
               <w:rPr>
                 <w:rStyle w:val="Hyperlink"/>
@@ -9650,7 +9650,7 @@
                 <w:noProof/>
                 <w:webHidden/>
               </w:rPr>
-              <w:instrText xml:space="preserve"> PAGEREF _Toc235983622 \h </w:instrText>
+              <w:instrText xml:space="preserve"> PAGEREF _Toc236342162 \h </w:instrText>
             </w:r>
             <w:r>
               <w:rPr>
@@ -9693,7 +9693,7 @@
               <w:lang w:val="en-US"/>
             </w:rPr>
           </w:pPr>
-          <w:hyperlink w:anchor="_Toc235983623" w:history="1">
+          <w:hyperlink w:anchor="_Toc236342163" w:history="1">
             <w:r>
               <w:rPr>
                 <w:rStyle w:val="Hyperlink"/>
@@ -9722,7 +9722,7 @@
                 <w:noProof/>
                 <w:webHidden/>
               </w:rPr>
-              <w:instrText xml:space="preserve"> PAGEREF _Toc235983623 \h </w:instrText>
+              <w:instrText xml:space="preserve"> PAGEREF _Toc236342163 \h </w:instrText>
             </w:r>
             <w:r>
               <w:rPr>
@@ -9765,7 +9765,7 @@
               <w:lang w:val="en-US"/>
             </w:rPr>
           </w:pPr>
-          <w:hyperlink w:anchor="_Toc235983624" w:history="1">
+          <w:hyperlink w:anchor="_Toc236342164" w:history="1">
             <w:r>
               <w:rPr>
                 <w:rStyle w:val="Hyperlink"/>
@@ -9794,7 +9794,7 @@
                 <w:noProof/>
                 <w:webHidden/>
               </w:rPr>
-              <w:instrText xml:space="preserve"> PAGEREF _Toc235983624 \h </w:instrText>
+              <w:instrText xml:space="preserve"> PAGEREF _Toc236342164 \h </w:instrText>
             </w:r>
             <w:r>
               <w:rPr>
@@ -9837,7 +9837,7 @@
               <w:lang w:val="en-US"/>
             </w:rPr>
           </w:pPr>
-          <w:hyperlink w:anchor="_Toc235983625" w:history="1">
+          <w:hyperlink w:anchor="_Toc236342165" w:history="1">
             <w:r>
               <w:rPr>
                 <w:rStyle w:val="Hyperlink"/>
@@ -9876,7 +9876,7 @@
                 <w:noProof/>
                 <w:webHidden/>
               </w:rPr>
-              <w:instrText xml:space="preserve"> PAGEREF _Toc235983625 \h </w:instrText>
+              <w:instrText xml:space="preserve"> PAGEREF _Toc236342165 \h </w:instrText>
             </w:r>
             <w:r>
               <w:rPr>
@@ -9919,7 +9919,7 @@
               <w:lang w:val="en-US"/>
             </w:rPr>
           </w:pPr>
-          <w:hyperlink w:anchor="_Toc235983626" w:history="1">
+          <w:hyperlink w:anchor="_Toc236342166" w:history="1">
             <w:r>
               <w:rPr>
                 <w:rStyle w:val="Hyperlink"/>
@@ -9948,7 +9948,7 @@
                 <w:noProof/>
                 <w:webHidden/>
               </w:rPr>
-              <w:instrText xml:space="preserve"> PAGEREF _Toc235983626 \h </w:instrText>
+              <w:instrText xml:space="preserve"> PAGEREF _Toc236342166 \h </w:instrText>
             </w:r>
             <w:r>
               <w:rPr>
@@ -9991,7 +9991,7 @@
               <w:lang w:val="en-US"/>
             </w:rPr>
           </w:pPr>
-          <w:hyperlink w:anchor="_Toc235983627" w:history="1">
+          <w:hyperlink w:anchor="_Toc236342167" w:history="1">
             <w:r>
               <w:rPr>
                 <w:rStyle w:val="Hyperlink"/>
@@ -10020,7 +10020,7 @@
                 <w:noProof/>
                 <w:webHidden/>
               </w:rPr>
-              <w:instrText xml:space="preserve"> PAGEREF _Toc235983627 \h </w:instrText>
+              <w:instrText xml:space="preserve"> PAGEREF _Toc236342167 \h </w:instrText>
             </w:r>
             <w:r>
               <w:rPr>
@@ -10063,7 +10063,7 @@
               <w:lang w:val="en-US"/>
             </w:rPr>
           </w:pPr>
-          <w:hyperlink w:anchor="_Toc235983628" w:history="1">
+          <w:hyperlink w:anchor="_Toc236342168" w:history="1">
             <w:r>
               <w:rPr>
                 <w:rStyle w:val="Hyperlink"/>
@@ -10092,7 +10092,7 @@
                 <w:noProof/>
                 <w:webHidden/>
               </w:rPr>
-              <w:instrText xml:space="preserve"> PAGEREF _Toc235983628 \h </w:instrText>
+              <w:instrText xml:space="preserve"> PAGEREF _Toc236342168 \h </w:instrText>
             </w:r>
             <w:r>
               <w:rPr>
@@ -10135,7 +10135,7 @@
               <w:lang w:val="en-US"/>
             </w:rPr>
           </w:pPr>
-          <w:hyperlink w:anchor="_Toc235983629" w:history="1">
+          <w:hyperlink w:anchor="_Toc236342169" w:history="1">
             <w:r>
               <w:rPr>
                 <w:rStyle w:val="Hyperlink"/>
@@ -10164,7 +10164,7 @@
                 <w:noProof/>
                 <w:webHidden/>
               </w:rPr>
-              <w:instrText xml:space="preserve"> PAGEREF _Toc235983629 \h </w:instrText>
+              <w:instrText xml:space="preserve"> PAGEREF _Toc236342169 \h </w:instrText>
             </w:r>
             <w:r>
               <w:rPr>
@@ -10207,7 +10207,7 @@
               <w:lang w:val="en-US"/>
             </w:rPr>
           </w:pPr>
-          <w:hyperlink w:anchor="_Toc235983630" w:history="1">
+          <w:hyperlink w:anchor="_Toc236342170" w:history="1">
             <w:r>
               <w:rPr>
                 <w:rStyle w:val="Hyperlink"/>
@@ -10236,7 +10236,7 @@
                 <w:noProof/>
                 <w:webHidden/>
               </w:rPr>
-              <w:instrText xml:space="preserve"> PAGEREF _Toc235983630 \h </w:instrText>
+              <w:instrText xml:space="preserve"> PAGEREF _Toc236342170 \h </w:instrText>
             </w:r>
             <w:r>
               <w:rPr>
@@ -10279,7 +10279,7 @@
               <w:lang w:val="en-US"/>
             </w:rPr>
           </w:pPr>
-          <w:hyperlink w:anchor="_Toc235983631" w:history="1">
+          <w:hyperlink w:anchor="_Toc236342171" w:history="1">
             <w:r>
               <w:rPr>
                 <w:rStyle w:val="Hyperlink"/>
@@ -10308,7 +10308,7 @@
                 <w:noProof/>
                 <w:webHidden/>
               </w:rPr>
-              <w:instrText xml:space="preserve"> PAGEREF _Toc235983631 \h </w:instrText>
+              <w:instrText xml:space="preserve"> PAGEREF _Toc236342171 \h </w:instrText>
             </w:r>
             <w:r>
               <w:rPr>
@@ -10351,7 +10351,7 @@
               <w:lang w:val="en-US"/>
             </w:rPr>
           </w:pPr>
-          <w:hyperlink w:anchor="_Toc235983632" w:history="1">
+          <w:hyperlink w:anchor="_Toc236342172" w:history="1">
             <w:r>
               <w:rPr>
                 <w:rStyle w:val="Hyperlink"/>
@@ -10380,7 +10380,7 @@
                 <w:noProof/>
                 <w:webHidden/>
               </w:rPr>
-              <w:instrText xml:space="preserve"> PAGEREF _Toc235983632 \h </w:instrText>
+              <w:instrText xml:space="preserve"> PAGEREF _Toc236342172 \h </w:instrText>
             </w:r>
             <w:r>
               <w:rPr>
@@ -10423,7 +10423,7 @@
               <w:lang w:val="en-US"/>
             </w:rPr>
           </w:pPr>
-          <w:hyperlink w:anchor="_Toc235983633" w:history="1">
+          <w:hyperlink w:anchor="_Toc236342173" w:history="1">
             <w:r>
               <w:rPr>
                 <w:rStyle w:val="Hyperlink"/>
@@ -10450,7 +10450,7 @@
                 <w:noProof/>
                 <w:webHidden/>
               </w:rPr>
-              <w:instrText xml:space="preserve"> PAGEREF _Toc235983633 \h </w:instrText>
+              <w:instrText xml:space="preserve"> PAGEREF _Toc236342173 \h </w:instrText>
             </w:r>
             <w:r>
               <w:rPr>
@@ -10493,7 +10493,7 @@
               <w:lang w:val="en-US"/>
             </w:rPr>
           </w:pPr>
-          <w:hyperlink w:anchor="_Toc235983634" w:history="1">
+          <w:hyperlink w:anchor="_Toc236342174" w:history="1">
             <w:r>
               <w:rPr>
                 <w:rStyle w:val="Hyperlink"/>
@@ -10520,7 +10520,7 @@
                 <w:noProof/>
                 <w:webHidden/>
               </w:rPr>
-              <w:instrText xml:space="preserve"> PAGEREF _Toc235983634 \h </w:instrText>
+              <w:instrText xml:space="preserve"> PAGEREF _Toc236342174 \h </w:instrText>
             </w:r>
             <w:r>
               <w:rPr>
@@ -10563,7 +10563,7 @@
               <w:lang w:val="en-US"/>
             </w:rPr>
           </w:pPr>
-          <w:hyperlink w:anchor="_Toc235983635" w:history="1">
+          <w:hyperlink w:anchor="_Toc236342175" w:history="1">
             <w:r>
               <w:rPr>
                 <w:rStyle w:val="Hyperlink"/>
@@ -10590,7 +10590,7 @@
                 <w:noProof/>
                 <w:webHidden/>
               </w:rPr>
-              <w:instrText xml:space="preserve"> PAGEREF _Toc235983635 \h </w:instrText>
+              <w:instrText xml:space="preserve"> PAGEREF _Toc236342175 \h </w:instrText>
             </w:r>
             <w:r>
               <w:rPr>
@@ -10611,81 +10611,6 @@
                 <w:webHidden/>
               </w:rPr>
               <w:t>95</w:t>
-            </w:r>
-            <w:r>
-              <w:rPr>
-                <w:noProof/>
-                <w:webHidden/>
-              </w:rPr>
-              <w:fldChar w:fldCharType="end"/>
-            </w:r>
-          </w:hyperlink>
-        </w:p>
-        <w:p>
-          <w:pPr>
-            <w:pStyle w:val="TOC1"/>
-            <w:tabs>
-              <w:tab w:val="right" w:leader="dot" w:pos="9016"/>
-            </w:tabs>
-            <w:rPr>
-              <w:rFonts w:asciiTheme="minorHAnsi" w:eastAsiaTheme="minorEastAsia" w:hAnsiTheme="minorHAnsi"/>
-              <w:noProof/>
-              <w:lang w:val="en-US"/>
-            </w:rPr>
-          </w:pPr>
-          <w:hyperlink w:anchor="_Toc235983636" w:history="1">
-            <w:r>
-              <w:rPr>
-                <w:rStyle w:val="Hyperlink"/>
-                <w:rFonts w:ascii="Verdana" w:eastAsia="Times New Roman" w:hAnsi="Verdana" w:cs="Times New Roman"/>
-                <w:b/>
-                <w:bCs/>
-                <w:noProof/>
-                <w:kern w:val="36"/>
-                <w:lang w:val="en-US"/>
-              </w:rPr>
-              <w:t>Checklist of Items for the Final Dissertation / Project / Project Work Report</w:t>
-            </w:r>
-            <w:r>
-              <w:rPr>
-                <w:noProof/>
-                <w:webHidden/>
-              </w:rPr>
-              <w:tab/>
-            </w:r>
-            <w:r>
-              <w:rPr>
-                <w:noProof/>
-                <w:webHidden/>
-              </w:rPr>
-              <w:fldChar w:fldCharType="begin"/>
-            </w:r>
-            <w:r>
-              <w:rPr>
-                <w:noProof/>
-                <w:webHidden/>
-              </w:rPr>
-              <w:instrText xml:space="preserve"> PAGEREF _Toc235983636 \h </w:instrText>
-            </w:r>
-            <w:r>
-              <w:rPr>
-                <w:noProof/>
-                <w:webHidden/>
-              </w:rPr>
-            </w:r>
-            <w:r>
-              <w:rPr>
-                <w:noProof/>
-                <w:webHidden/>
-              </w:rPr>
-              <w:fldChar w:fldCharType="separate"/>
-            </w:r>
-            <w:r>
-              <w:rPr>
-                <w:noProof/>
-                <w:webHidden/>
-              </w:rPr>
-              <w:t>100</w:t>
             </w:r>
             <w:r>
               <w:rPr>
@@ -13630,7 +13555,7 @@
           <w:szCs w:val="36"/>
         </w:rPr>
       </w:pPr>
-      <w:bookmarkStart w:id="3" w:name="_Toc235983526"/>
+      <w:bookmarkStart w:id="3" w:name="_Toc236342066"/>
       <w:r>
         <w:rPr>
           <w:sz w:val="36"/>
@@ -13651,7 +13576,7 @@
           <w:lang w:val="en-US"/>
         </w:rPr>
       </w:pPr>
-      <w:bookmarkStart w:id="4" w:name="_Toc235983527"/>
+      <w:bookmarkStart w:id="4" w:name="_Toc236342067"/>
       <w:r>
         <w:rPr>
           <w:rFonts w:ascii="Times New Roman" w:hAnsi="Times New Roman" w:cs="Times New Roman"/>
@@ -13782,7 +13707,7 @@
           <w:lang w:val="en-US"/>
         </w:rPr>
       </w:pPr>
-      <w:bookmarkStart w:id="5" w:name="_Toc235983528"/>
+      <w:bookmarkStart w:id="5" w:name="_Toc236342068"/>
       <w:r>
         <w:rPr>
           <w:rFonts w:ascii="Times New Roman" w:hAnsi="Times New Roman" w:cs="Times New Roman"/>
@@ -14190,7 +14115,7 @@
           <w:lang w:val="en-US"/>
         </w:rPr>
       </w:pPr>
-      <w:bookmarkStart w:id="6" w:name="_Toc235983529"/>
+      <w:bookmarkStart w:id="6" w:name="_Toc236342069"/>
       <w:r>
         <w:rPr>
           <w:rFonts w:ascii="Times New Roman" w:hAnsi="Times New Roman" w:cs="Times New Roman"/>
@@ -14367,7 +14292,7 @@
           <w:lang w:val="en-US"/>
         </w:rPr>
       </w:pPr>
-      <w:bookmarkStart w:id="7" w:name="_Toc235983530"/>
+      <w:bookmarkStart w:id="7" w:name="_Toc236342070"/>
       <w:r>
         <w:rPr>
           <w:rFonts w:ascii="Times New Roman" w:hAnsi="Times New Roman" w:cs="Times New Roman"/>
@@ -14575,7 +14500,7 @@
           <w:lang w:val="en-US"/>
         </w:rPr>
       </w:pPr>
-      <w:bookmarkStart w:id="8" w:name="_Toc235983531"/>
+      <w:bookmarkStart w:id="8" w:name="_Toc236342071"/>
       <w:r>
         <w:rPr>
           <w:rFonts w:ascii="Times New Roman" w:hAnsi="Times New Roman" w:cs="Times New Roman"/>
@@ -14846,7 +14771,7 @@
           <w:lang w:val="en-US"/>
         </w:rPr>
       </w:pPr>
-      <w:bookmarkStart w:id="9" w:name="_Toc235983532"/>
+      <w:bookmarkStart w:id="9" w:name="_Toc236342072"/>
       <w:r>
         <w:rPr>
           <w:rFonts w:ascii="Times New Roman" w:hAnsi="Times New Roman" w:cs="Times New Roman"/>
@@ -15026,7 +14951,7 @@
           <w:szCs w:val="36"/>
         </w:rPr>
       </w:pPr>
-      <w:bookmarkStart w:id="10" w:name="_Toc235983533"/>
+      <w:bookmarkStart w:id="10" w:name="_Toc236342073"/>
       <w:r>
         <w:rPr>
           <w:sz w:val="36"/>
@@ -15047,7 +14972,7 @@
           <w:szCs w:val="28"/>
         </w:rPr>
       </w:pPr>
-      <w:bookmarkStart w:id="11" w:name="_Toc235983534"/>
+      <w:bookmarkStart w:id="11" w:name="_Toc236342074"/>
       <w:r>
         <w:rPr>
           <w:rFonts w:ascii="Times New Roman" w:eastAsia="Times New Roman" w:hAnsi="Times New Roman" w:cs="Times New Roman"/>
@@ -15357,7 +15282,7 @@
           <w:szCs w:val="28"/>
         </w:rPr>
       </w:pPr>
-      <w:bookmarkStart w:id="12" w:name="_Toc235983535"/>
+      <w:bookmarkStart w:id="12" w:name="_Toc236342075"/>
       <w:r>
         <w:rPr>
           <w:rFonts w:ascii="Times New Roman" w:eastAsia="Times New Roman" w:hAnsi="Times New Roman" w:cs="Times New Roman"/>
@@ -15380,7 +15305,7 @@
           <w:lang w:val="en-US"/>
         </w:rPr>
       </w:pPr>
-      <w:bookmarkStart w:id="13" w:name="_Toc235983536"/>
+      <w:bookmarkStart w:id="13" w:name="_Toc236342076"/>
       <w:r>
         <w:rPr>
           <w:rFonts w:ascii="Times New Roman" w:hAnsi="Times New Roman" w:cs="Times New Roman"/>
@@ -15447,7 +15372,7 @@
           <w:lang w:val="en-US"/>
         </w:rPr>
       </w:pPr>
-      <w:bookmarkStart w:id="14" w:name="_Toc235983537"/>
+      <w:bookmarkStart w:id="14" w:name="_Toc236342077"/>
       <w:r>
         <w:rPr>
           <w:rFonts w:ascii="Times New Roman" w:hAnsi="Times New Roman" w:cs="Times New Roman"/>
@@ -16728,7 +16653,7 @@
           <w:lang w:val="en-US"/>
         </w:rPr>
       </w:pPr>
-      <w:bookmarkStart w:id="16" w:name="_Toc235983538"/>
+      <w:bookmarkStart w:id="16" w:name="_Toc236342078"/>
       <w:r>
         <w:rPr>
           <w:rFonts w:ascii="Times New Roman" w:hAnsi="Times New Roman" w:cs="Times New Roman"/>
@@ -16827,7 +16752,7 @@
           <w:szCs w:val="28"/>
         </w:rPr>
       </w:pPr>
-      <w:bookmarkStart w:id="17" w:name="_Toc235983539"/>
+      <w:bookmarkStart w:id="17" w:name="_Toc236342079"/>
       <w:r>
         <w:rPr>
           <w:rFonts w:ascii="Times New Roman" w:eastAsia="Times New Roman" w:hAnsi="Times New Roman" w:cs="Times New Roman"/>
@@ -16850,7 +16775,7 @@
           <w:lang w:val="en-US"/>
         </w:rPr>
       </w:pPr>
-      <w:bookmarkStart w:id="18" w:name="_Toc235983540"/>
+      <w:bookmarkStart w:id="18" w:name="_Toc236342080"/>
       <w:r>
         <w:rPr>
           <w:rFonts w:ascii="Times New Roman" w:hAnsi="Times New Roman" w:cs="Times New Roman"/>
@@ -16893,7 +16818,7 @@
           <w:lang w:val="en-US"/>
         </w:rPr>
       </w:pPr>
-      <w:bookmarkStart w:id="19" w:name="_Toc235983541"/>
+      <w:bookmarkStart w:id="19" w:name="_Toc236342081"/>
       <w:r>
         <w:rPr>
           <w:rFonts w:ascii="Times New Roman" w:hAnsi="Times New Roman" w:cs="Times New Roman"/>
@@ -17915,7 +17840,7 @@
           <w:lang w:val="en-US"/>
         </w:rPr>
       </w:pPr>
-      <w:bookmarkStart w:id="21" w:name="_Toc235983542"/>
+      <w:bookmarkStart w:id="21" w:name="_Toc236342082"/>
       <w:r>
         <w:rPr>
           <w:rFonts w:ascii="Times New Roman" w:hAnsi="Times New Roman" w:cs="Times New Roman"/>
@@ -17988,7 +17913,7 @@
           <w:lang w:val="en-US"/>
         </w:rPr>
       </w:pPr>
-      <w:bookmarkStart w:id="22" w:name="_Toc235983543"/>
+      <w:bookmarkStart w:id="22" w:name="_Toc236342083"/>
       <w:r>
         <w:rPr>
           <w:rFonts w:ascii="Times New Roman" w:hAnsi="Times New Roman" w:cs="Times New Roman"/>
@@ -18124,7 +18049,6 @@
     <w:p>
       <w:pPr>
         <w:spacing w:after="0" w:line="480" w:lineRule="auto"/>
-        <w:ind w:firstLine="720"/>
         <w:jc w:val="both"/>
         <w:rPr>
           <w:rFonts w:cs="Times New Roman"/>
@@ -18166,7 +18090,7 @@
           <w:lang w:val="en-US"/>
         </w:rPr>
       </w:pPr>
-      <w:bookmarkStart w:id="23" w:name="_Toc235983544"/>
+      <w:bookmarkStart w:id="23" w:name="_Toc236342084"/>
       <w:r>
         <w:rPr>
           <w:rFonts w:ascii="Times New Roman" w:hAnsi="Times New Roman" w:cs="Times New Roman"/>
@@ -18379,7 +18303,7 @@
           <w:szCs w:val="28"/>
         </w:rPr>
       </w:pPr>
-      <w:bookmarkStart w:id="24" w:name="_Toc235983545"/>
+      <w:bookmarkStart w:id="24" w:name="_Toc236342085"/>
       <w:r>
         <w:rPr>
           <w:rFonts w:ascii="Times New Roman" w:eastAsia="Times New Roman" w:hAnsi="Times New Roman" w:cs="Times New Roman"/>
@@ -18394,6 +18318,8 @@
     <w:p>
       <w:pPr>
         <w:pStyle w:val="Heading3"/>
+        <w:spacing w:line="480" w:lineRule="auto"/>
+        <w:jc w:val="both"/>
         <w:rPr>
           <w:rFonts w:ascii="Times New Roman" w:hAnsi="Times New Roman" w:cs="Times New Roman"/>
           <w:sz w:val="24"/>
@@ -18401,7 +18327,7 @@
           <w:lang w:val="en-US"/>
         </w:rPr>
       </w:pPr>
-      <w:bookmarkStart w:id="25" w:name="_Toc235983546"/>
+      <w:bookmarkStart w:id="25" w:name="_Toc236342086"/>
       <w:r>
         <w:rPr>
           <w:rFonts w:ascii="Times New Roman" w:hAnsi="Times New Roman" w:cs="Times New Roman"/>
@@ -18458,7 +18384,7 @@
           <w:lang w:val="en-US"/>
         </w:rPr>
       </w:pPr>
-      <w:bookmarkStart w:id="26" w:name="_Toc235983547"/>
+      <w:bookmarkStart w:id="26" w:name="_Toc236342087"/>
       <w:r>
         <w:rPr>
           <w:rFonts w:ascii="Times New Roman" w:hAnsi="Times New Roman" w:cs="Times New Roman"/>
@@ -19649,7 +19575,7 @@
           <w:lang w:val="en-US"/>
         </w:rPr>
       </w:pPr>
-      <w:bookmarkStart w:id="28" w:name="_Toc235983548"/>
+      <w:bookmarkStart w:id="28" w:name="_Toc236342088"/>
       <w:r>
         <w:rPr>
           <w:rFonts w:ascii="Times New Roman" w:hAnsi="Times New Roman" w:cs="Times New Roman"/>
@@ -19761,7 +19687,7 @@
           <w:lang w:val="en-US"/>
         </w:rPr>
       </w:pPr>
-      <w:bookmarkStart w:id="29" w:name="_Toc235983549"/>
+      <w:bookmarkStart w:id="29" w:name="_Toc236342089"/>
       <w:r>
         <w:rPr>
           <w:rFonts w:ascii="Times New Roman" w:hAnsi="Times New Roman" w:cs="Times New Roman"/>
@@ -19961,7 +19887,25 @@
           <w:szCs w:val="24"/>
           <w:lang w:val="en-US"/>
         </w:rPr>
-        <w:t> The legal NLP literature reveals a clear consensus: domain-specific pre-training is necessary but insufficient for trustworthy legal AI. The persistence of hallucination and reasoning gaps across all models confirms the need for complementary approaches including RAG, governance, and explainability—all of which are integrated in our proposed platform.</w:t>
+        <w:t> The legal NLP literature reveals a clear consensus: domain-specific pre-training is necessary but insufficient for trustworthy legal AI. The persistence of hallucination and reasoning gaps across all models confirms the need for complementary approaches including RAG,</w:t>
+      </w:r>
+      <w:r>
+        <w:rPr>
+          <w:rFonts w:cs="Times New Roman"/>
+          <w:sz w:val="24"/>
+          <w:szCs w:val="24"/>
+          <w:lang w:val="en-US"/>
+        </w:rPr>
+        <w:t xml:space="preserve"> governance, and explainability, </w:t>
+      </w:r>
+      <w:r>
+        <w:rPr>
+          <w:rFonts w:cs="Times New Roman"/>
+          <w:sz w:val="24"/>
+          <w:szCs w:val="24"/>
+          <w:lang w:val="en-US"/>
+        </w:rPr>
+        <w:t>all of which are integrated in our proposed platform.</w:t>
       </w:r>
     </w:p>
     <w:p>
@@ -19986,7 +19930,7 @@
           <w:szCs w:val="28"/>
         </w:rPr>
       </w:pPr>
-      <w:bookmarkStart w:id="30" w:name="_Toc235983550"/>
+      <w:bookmarkStart w:id="30" w:name="_Toc236342090"/>
       <w:r>
         <w:rPr>
           <w:rFonts w:ascii="Times New Roman" w:eastAsia="Times New Roman" w:hAnsi="Times New Roman" w:cs="Times New Roman"/>
@@ -20009,7 +19953,7 @@
           <w:lang w:val="en-US"/>
         </w:rPr>
       </w:pPr>
-      <w:bookmarkStart w:id="31" w:name="_Toc235983551"/>
+      <w:bookmarkStart w:id="31" w:name="_Toc236342091"/>
       <w:r>
         <w:rPr>
           <w:rFonts w:ascii="Times New Roman" w:hAnsi="Times New Roman" w:cs="Times New Roman"/>
@@ -20055,7 +19999,7 @@
           <w:lang w:val="en-US"/>
         </w:rPr>
       </w:pPr>
-      <w:bookmarkStart w:id="32" w:name="_Toc235983552"/>
+      <w:bookmarkStart w:id="32" w:name="_Toc236342092"/>
       <w:r>
         <w:rPr>
           <w:rFonts w:ascii="Times New Roman" w:hAnsi="Times New Roman" w:cs="Times New Roman"/>
@@ -20861,7 +20805,7 @@
           <w:lang w:val="en-US"/>
         </w:rPr>
       </w:pPr>
-      <w:bookmarkStart w:id="34" w:name="_Toc235983553"/>
+      <w:bookmarkStart w:id="34" w:name="_Toc236342093"/>
       <w:r>
         <w:rPr>
           <w:rFonts w:ascii="Times New Roman" w:hAnsi="Times New Roman" w:cs="Times New Roman"/>
@@ -20973,7 +20917,7 @@
           <w:lang w:val="en-US"/>
         </w:rPr>
       </w:pPr>
-      <w:bookmarkStart w:id="35" w:name="_Toc235983554"/>
+      <w:bookmarkStart w:id="35" w:name="_Toc236342094"/>
       <w:r>
         <w:rPr>
           <w:rFonts w:ascii="Times New Roman" w:hAnsi="Times New Roman" w:cs="Times New Roman"/>
@@ -21177,7 +21121,7 @@
           <w:szCs w:val="28"/>
         </w:rPr>
       </w:pPr>
-      <w:bookmarkStart w:id="36" w:name="_Toc235983555"/>
+      <w:bookmarkStart w:id="36" w:name="_Toc236342095"/>
       <w:r>
         <w:rPr>
           <w:rFonts w:ascii="Times New Roman" w:eastAsia="Times New Roman" w:hAnsi="Times New Roman" w:cs="Times New Roman"/>
@@ -21201,7 +21145,7 @@
           <w:lang w:val="en-US"/>
         </w:rPr>
       </w:pPr>
-      <w:bookmarkStart w:id="37" w:name="_Toc235983556"/>
+      <w:bookmarkStart w:id="37" w:name="_Toc236342096"/>
       <w:r>
         <w:rPr>
           <w:rFonts w:ascii="Times New Roman" w:hAnsi="Times New Roman" w:cs="Times New Roman"/>
@@ -21317,7 +21261,7 @@
           <w:lang w:val="en-US"/>
         </w:rPr>
       </w:pPr>
-      <w:bookmarkStart w:id="38" w:name="_Toc235983557"/>
+      <w:bookmarkStart w:id="38" w:name="_Toc236342097"/>
       <w:r>
         <w:rPr>
           <w:rFonts w:ascii="Times New Roman" w:hAnsi="Times New Roman" w:cs="Times New Roman"/>
@@ -21407,7 +21351,7 @@
           <w:lang w:val="en-US"/>
         </w:rPr>
       </w:pPr>
-      <w:bookmarkStart w:id="39" w:name="_Toc235983558"/>
+      <w:bookmarkStart w:id="39" w:name="_Toc236342098"/>
       <w:r>
         <w:rPr>
           <w:rFonts w:ascii="Times New Roman" w:hAnsi="Times New Roman" w:cs="Times New Roman"/>
@@ -21460,7 +21404,25 @@
           <w:szCs w:val="24"/>
           <w:lang w:val="en-US"/>
         </w:rPr>
-        <w:t>The ReAct approach has been particularly influential in agentic AI, providing a foundation for building agents that can reason about tasks, plan actions, and iteratively refine their approach based on feedback. This capability is essential for complex compliance workflows that require multi-step reasoning and tool invocation.</w:t>
+        <w:t>The ReAct approach has bee</w:t>
+      </w:r>
+      <w:r>
+        <w:rPr>
+          <w:rFonts w:cs="Times New Roman"/>
+          <w:sz w:val="24"/>
+          <w:szCs w:val="24"/>
+          <w:lang w:val="en-US"/>
+        </w:rPr>
+        <w:t>n particularly influential in A</w:t>
+      </w:r>
+      <w:r>
+        <w:rPr>
+          <w:rFonts w:cs="Times New Roman"/>
+          <w:sz w:val="24"/>
+          <w:szCs w:val="24"/>
+          <w:lang w:val="en-US"/>
+        </w:rPr>
+        <w:t>gentic AI, providing a foundation for building agents that can reason about tasks, plan actions, and iteratively refine their approach based on feedback. This capability is essential for complex compliance workflows that require multi-step reasoning and tool invocation.</w:t>
       </w:r>
     </w:p>
     <w:p>
@@ -21503,7 +21465,7 @@
           <w:lang w:val="en-US"/>
         </w:rPr>
       </w:pPr>
-      <w:bookmarkStart w:id="40" w:name="_Toc235983559"/>
+      <w:bookmarkStart w:id="40" w:name="_Toc236342099"/>
       <w:r>
         <w:rPr>
           <w:rFonts w:ascii="Times New Roman" w:hAnsi="Times New Roman" w:cs="Times New Roman"/>
@@ -21682,7 +21644,16 @@
           <w:szCs w:val="24"/>
           <w:lang w:val="en-US"/>
         </w:rPr>
-        <w:t> The agentic AI literature confirms the superiority of multi-agent architectures for complex enterprise workflows. However, existing frameworks primarily focus on task coordination rather than governance and explainability. Our platform addresses this gap by integrating Guardrails and SHAP within the LangGraph orchestration framework.</w:t>
+        <w:t> The A</w:t>
+      </w:r>
+      <w:r>
+        <w:rPr>
+          <w:rFonts w:cs="Times New Roman"/>
+          <w:sz w:val="24"/>
+          <w:szCs w:val="24"/>
+          <w:lang w:val="en-US"/>
+        </w:rPr>
+        <w:t>gentic AI literature confirms the superiority of multi-agent architectures for complex enterprise workflows. However, existing frameworks primarily focus on task coordination rather than governance and explainability. Our platform addresses this gap by integrating Guardrails and SHAP within the LangGraph orchestration framework.</w:t>
       </w:r>
     </w:p>
     <w:p>
@@ -22486,7 +22457,7 @@
           <w:szCs w:val="28"/>
         </w:rPr>
       </w:pPr>
-      <w:bookmarkStart w:id="42" w:name="_Toc235983560"/>
+      <w:bookmarkStart w:id="42" w:name="_Toc236342100"/>
       <w:r>
         <w:rPr>
           <w:rFonts w:ascii="Times New Roman" w:eastAsia="Times New Roman" w:hAnsi="Times New Roman" w:cs="Times New Roman"/>
@@ -22509,7 +22480,7 @@
           <w:lang w:val="en-US"/>
         </w:rPr>
       </w:pPr>
-      <w:bookmarkStart w:id="43" w:name="_Toc235983561"/>
+      <w:bookmarkStart w:id="43" w:name="_Toc236342101"/>
       <w:r>
         <w:rPr>
           <w:rFonts w:ascii="Times New Roman" w:hAnsi="Times New Roman" w:cs="Times New Roman"/>
@@ -22598,7 +22569,7 @@
           <w:lang w:val="en-US"/>
         </w:rPr>
       </w:pPr>
-      <w:bookmarkStart w:id="44" w:name="_Toc235983562"/>
+      <w:bookmarkStart w:id="44" w:name="_Toc236342102"/>
       <w:r>
         <w:rPr>
           <w:rFonts w:ascii="Times New Roman" w:hAnsi="Times New Roman" w:cs="Times New Roman"/>
@@ -23490,7 +23461,7 @@
           <w:lang w:val="en-US"/>
         </w:rPr>
       </w:pPr>
-      <w:bookmarkStart w:id="46" w:name="_Toc235983563"/>
+      <w:bookmarkStart w:id="46" w:name="_Toc236342103"/>
       <w:r>
         <w:rPr>
           <w:rFonts w:ascii="Times New Roman" w:hAnsi="Times New Roman" w:cs="Times New Roman"/>
@@ -23630,7 +23601,7 @@
           <w:szCs w:val="28"/>
         </w:rPr>
       </w:pPr>
-      <w:bookmarkStart w:id="47" w:name="_Toc235983564"/>
+      <w:bookmarkStart w:id="47" w:name="_Toc236342104"/>
       <w:r>
         <w:rPr>
           <w:rFonts w:ascii="Times New Roman" w:eastAsia="Times New Roman" w:hAnsi="Times New Roman" w:cs="Times New Roman"/>
@@ -23653,7 +23624,7 @@
           <w:lang w:val="en-US"/>
         </w:rPr>
       </w:pPr>
-      <w:bookmarkStart w:id="48" w:name="_Toc235983565"/>
+      <w:bookmarkStart w:id="48" w:name="_Toc236342105"/>
       <w:r>
         <w:rPr>
           <w:rFonts w:ascii="Times New Roman" w:hAnsi="Times New Roman" w:cs="Times New Roman"/>
@@ -23742,7 +23713,7 @@
           <w:lang w:val="en-US"/>
         </w:rPr>
       </w:pPr>
-      <w:bookmarkStart w:id="49" w:name="_Toc235983566"/>
+      <w:bookmarkStart w:id="49" w:name="_Toc236342106"/>
       <w:r>
         <w:rPr>
           <w:rFonts w:ascii="Times New Roman" w:hAnsi="Times New Roman" w:cs="Times New Roman"/>
@@ -24314,7 +24285,7 @@
           <w:lang w:val="en-US"/>
         </w:rPr>
       </w:pPr>
-      <w:bookmarkStart w:id="51" w:name="_Toc235983567"/>
+      <w:bookmarkStart w:id="51" w:name="_Toc236342107"/>
       <w:r>
         <w:rPr>
           <w:rFonts w:ascii="Times New Roman" w:hAnsi="Times New Roman" w:cs="Times New Roman"/>
@@ -24662,7 +24633,7 @@
           <w:szCs w:val="28"/>
         </w:rPr>
       </w:pPr>
-      <w:bookmarkStart w:id="52" w:name="_Toc235983568"/>
+      <w:bookmarkStart w:id="52" w:name="_Toc236342108"/>
       <w:r>
         <w:rPr>
           <w:rFonts w:ascii="Times New Roman" w:eastAsia="Times New Roman" w:hAnsi="Times New Roman" w:cs="Times New Roman"/>
@@ -24685,7 +24656,7 @@
           <w:lang w:val="en-US"/>
         </w:rPr>
       </w:pPr>
-      <w:bookmarkStart w:id="53" w:name="_Toc235983569"/>
+      <w:bookmarkStart w:id="53" w:name="_Toc236342109"/>
       <w:r>
         <w:rPr>
           <w:rFonts w:ascii="Times New Roman" w:hAnsi="Times New Roman" w:cs="Times New Roman"/>
@@ -24753,7 +24724,7 @@
           <w:lang w:val="en-US"/>
         </w:rPr>
       </w:pPr>
-      <w:bookmarkStart w:id="54" w:name="_Toc235983570"/>
+      <w:bookmarkStart w:id="54" w:name="_Toc236342110"/>
       <w:r>
         <w:rPr>
           <w:rFonts w:ascii="Times New Roman" w:hAnsi="Times New Roman" w:cs="Times New Roman"/>
@@ -25412,7 +25383,7 @@
           <w:lang w:val="en-US"/>
         </w:rPr>
       </w:pPr>
-      <w:bookmarkStart w:id="56" w:name="_Toc235983571"/>
+      <w:bookmarkStart w:id="56" w:name="_Toc236342111"/>
       <w:r>
         <w:rPr>
           <w:rFonts w:ascii="Times New Roman" w:hAnsi="Times New Roman" w:cs="Times New Roman"/>
@@ -25606,7 +25577,7 @@
           <w:szCs w:val="28"/>
         </w:rPr>
       </w:pPr>
-      <w:bookmarkStart w:id="57" w:name="_Toc235983572"/>
+      <w:bookmarkStart w:id="57" w:name="_Toc236342112"/>
       <w:r>
         <w:rPr>
           <w:rFonts w:ascii="Times New Roman" w:eastAsia="Times New Roman" w:hAnsi="Times New Roman" w:cs="Times New Roman"/>
@@ -25629,7 +25600,7 @@
           <w:lang w:val="en-US"/>
         </w:rPr>
       </w:pPr>
-      <w:bookmarkStart w:id="58" w:name="_Toc235983573"/>
+      <w:bookmarkStart w:id="58" w:name="_Toc236342113"/>
       <w:r>
         <w:rPr>
           <w:rFonts w:ascii="Times New Roman" w:hAnsi="Times New Roman" w:cs="Times New Roman"/>
@@ -25899,7 +25870,7 @@
           <w:lang w:val="en-US"/>
         </w:rPr>
       </w:pPr>
-      <w:bookmarkStart w:id="59" w:name="_Toc235983574"/>
+      <w:bookmarkStart w:id="59" w:name="_Toc236342114"/>
       <w:r>
         <w:rPr>
           <w:rFonts w:ascii="Times New Roman" w:hAnsi="Times New Roman" w:cs="Times New Roman"/>
@@ -26500,7 +26471,7 @@
           <w:szCs w:val="28"/>
         </w:rPr>
       </w:pPr>
-      <w:bookmarkStart w:id="60" w:name="_Toc235983575"/>
+      <w:bookmarkStart w:id="60" w:name="_Toc236342115"/>
       <w:r>
         <w:rPr>
           <w:rFonts w:ascii="Times New Roman" w:hAnsi="Times New Roman" w:cs="Times New Roman"/>
@@ -27564,7 +27535,7 @@
           <w:szCs w:val="28"/>
         </w:rPr>
       </w:pPr>
-      <w:bookmarkStart w:id="62" w:name="_Toc235983576"/>
+      <w:bookmarkStart w:id="62" w:name="_Toc236342116"/>
       <w:r>
         <w:rPr>
           <w:rFonts w:ascii="Times New Roman" w:eastAsia="Times New Roman" w:hAnsi="Times New Roman" w:cs="Times New Roman"/>
@@ -27630,7 +27601,7 @@
           <w:szCs w:val="36"/>
         </w:rPr>
       </w:pPr>
-      <w:bookmarkStart w:id="63" w:name="_Toc235983577"/>
+      <w:bookmarkStart w:id="63" w:name="_Toc236342117"/>
       <w:r>
         <w:rPr>
           <w:sz w:val="36"/>
@@ -27650,7 +27621,7 @@
           <w:lang w:val="en-US"/>
         </w:rPr>
       </w:pPr>
-      <w:bookmarkStart w:id="64" w:name="_Toc235983578"/>
+      <w:bookmarkStart w:id="64" w:name="_Toc236342118"/>
       <w:r>
         <w:rPr>
           <w:rFonts w:ascii="Times New Roman" w:hAnsi="Times New Roman" w:cs="Times New Roman"/>
@@ -27919,7 +27890,7 @@
           <w:lang w:val="en-US"/>
         </w:rPr>
       </w:pPr>
-      <w:bookmarkStart w:id="65" w:name="_Toc235983579"/>
+      <w:bookmarkStart w:id="65" w:name="_Toc236342119"/>
       <w:r>
         <w:rPr>
           <w:rFonts w:ascii="Times New Roman" w:hAnsi="Times New Roman" w:cs="Times New Roman"/>
@@ -28601,7 +28572,7 @@
           <w:lang w:val="en-US"/>
         </w:rPr>
       </w:pPr>
-      <w:bookmarkStart w:id="67" w:name="_Toc235983580"/>
+      <w:bookmarkStart w:id="67" w:name="_Toc236342120"/>
       <w:r>
         <w:rPr>
           <w:rFonts w:ascii="Times New Roman" w:hAnsi="Times New Roman" w:cs="Times New Roman"/>
@@ -29541,7 +29512,7 @@
           <w:szCs w:val="28"/>
         </w:rPr>
       </w:pPr>
-      <w:bookmarkStart w:id="70" w:name="_Toc235983581"/>
+      <w:bookmarkStart w:id="70" w:name="_Toc236342121"/>
       <w:r>
         <w:rPr>
           <w:rFonts w:ascii="Times New Roman" w:eastAsia="Times New Roman" w:hAnsi="Times New Roman" w:cs="Times New Roman"/>
@@ -29563,7 +29534,7 @@
           <w:szCs w:val="24"/>
         </w:rPr>
       </w:pPr>
-      <w:bookmarkStart w:id="71" w:name="_Toc235983582"/>
+      <w:bookmarkStart w:id="71" w:name="_Toc236342122"/>
       <w:r>
         <w:rPr>
           <w:rFonts w:ascii="Times New Roman" w:eastAsia="Times New Roman" w:hAnsi="Times New Roman"/>
@@ -29950,7 +29921,7 @@
           <w:szCs w:val="24"/>
         </w:rPr>
       </w:pPr>
-      <w:bookmarkStart w:id="73" w:name="_Toc235983583"/>
+      <w:bookmarkStart w:id="73" w:name="_Toc236342123"/>
       <w:r>
         <w:rPr>
           <w:rFonts w:ascii="Times New Roman" w:eastAsia="Times New Roman" w:hAnsi="Times New Roman" w:cs="Times New Roman"/>
@@ -31636,7 +31607,7 @@
           <w:szCs w:val="24"/>
         </w:rPr>
       </w:pPr>
-      <w:bookmarkStart w:id="74" w:name="_Toc235983584"/>
+      <w:bookmarkStart w:id="74" w:name="_Toc236342124"/>
       <w:r>
         <w:rPr>
           <w:rFonts w:ascii="Times New Roman" w:eastAsia="Times New Roman" w:hAnsi="Times New Roman" w:cs="Times New Roman"/>
@@ -32717,7 +32688,7 @@
           <w:szCs w:val="28"/>
         </w:rPr>
       </w:pPr>
-      <w:bookmarkStart w:id="78" w:name="_Toc235983585"/>
+      <w:bookmarkStart w:id="78" w:name="_Toc236342125"/>
       <w:r>
         <w:rPr>
           <w:rFonts w:ascii="Times New Roman" w:eastAsia="Times New Roman" w:hAnsi="Times New Roman" w:cs="Times New Roman"/>
@@ -32739,7 +32710,7 @@
           <w:szCs w:val="24"/>
         </w:rPr>
       </w:pPr>
-      <w:bookmarkStart w:id="79" w:name="_Toc235983586"/>
+      <w:bookmarkStart w:id="79" w:name="_Toc236342126"/>
       <w:r>
         <w:rPr>
           <w:rFonts w:ascii="Times New Roman" w:eastAsia="Times New Roman" w:hAnsi="Times New Roman" w:cs="Times New Roman"/>
@@ -32883,7 +32854,7 @@
           <w:szCs w:val="24"/>
         </w:rPr>
       </w:pPr>
-      <w:bookmarkStart w:id="80" w:name="_Toc235983587"/>
+      <w:bookmarkStart w:id="80" w:name="_Toc236342127"/>
       <w:r>
         <w:rPr>
           <w:rFonts w:ascii="Times New Roman" w:hAnsi="Times New Roman" w:cs="Times New Roman"/>
@@ -33620,7 +33591,7 @@
           <w:szCs w:val="28"/>
         </w:rPr>
       </w:pPr>
-      <w:bookmarkStart w:id="82" w:name="_Toc235983588"/>
+      <w:bookmarkStart w:id="82" w:name="_Toc236342128"/>
       <w:r>
         <w:rPr>
           <w:rFonts w:ascii="Times New Roman" w:eastAsia="Times New Roman" w:hAnsi="Times New Roman" w:cs="Times New Roman"/>
@@ -33642,7 +33613,7 @@
           <w:szCs w:val="24"/>
         </w:rPr>
       </w:pPr>
-      <w:bookmarkStart w:id="83" w:name="_Toc235983589"/>
+      <w:bookmarkStart w:id="83" w:name="_Toc236342129"/>
       <w:r>
         <w:rPr>
           <w:rFonts w:ascii="Times New Roman" w:eastAsia="Times New Roman" w:hAnsi="Times New Roman" w:cs="Times New Roman"/>
@@ -34121,7 +34092,7 @@
           <w:szCs w:val="24"/>
         </w:rPr>
       </w:pPr>
-      <w:bookmarkStart w:id="85" w:name="_Toc235983590"/>
+      <w:bookmarkStart w:id="85" w:name="_Toc236342130"/>
       <w:r>
         <w:rPr>
           <w:rFonts w:ascii="Times New Roman" w:eastAsia="Times New Roman" w:hAnsi="Times New Roman" w:cs="Times New Roman"/>
@@ -34641,7 +34612,7 @@
           <w:szCs w:val="24"/>
         </w:rPr>
       </w:pPr>
-      <w:bookmarkStart w:id="86" w:name="_Toc235983591"/>
+      <w:bookmarkStart w:id="86" w:name="_Toc236342131"/>
       <w:r>
         <w:rPr>
           <w:rFonts w:ascii="Times New Roman" w:hAnsi="Times New Roman" w:cs="Times New Roman"/>
@@ -34888,7 +34859,7 @@
           <w:szCs w:val="28"/>
         </w:rPr>
       </w:pPr>
-      <w:bookmarkStart w:id="88" w:name="_Toc235983592"/>
+      <w:bookmarkStart w:id="88" w:name="_Toc236342132"/>
       <w:r>
         <w:rPr>
           <w:rFonts w:ascii="Times New Roman" w:eastAsia="Times New Roman" w:hAnsi="Times New Roman" w:cs="Times New Roman"/>
@@ -34910,7 +34881,7 @@
           <w:szCs w:val="24"/>
         </w:rPr>
       </w:pPr>
-      <w:bookmarkStart w:id="89" w:name="_Toc235983593"/>
+      <w:bookmarkStart w:id="89" w:name="_Toc236342133"/>
       <w:r>
         <w:rPr>
           <w:rFonts w:ascii="Times New Roman" w:eastAsia="Times New Roman" w:hAnsi="Times New Roman" w:cs="Times New Roman"/>
@@ -35466,7 +35437,7 @@
           <w:szCs w:val="24"/>
         </w:rPr>
       </w:pPr>
-      <w:bookmarkStart w:id="91" w:name="_Toc235983594"/>
+      <w:bookmarkStart w:id="91" w:name="_Toc236342134"/>
       <w:r>
         <w:rPr>
           <w:rFonts w:ascii="Times New Roman" w:hAnsi="Times New Roman" w:cs="Times New Roman"/>
@@ -35766,7 +35737,7 @@
           <w:szCs w:val="28"/>
         </w:rPr>
       </w:pPr>
-      <w:bookmarkStart w:id="92" w:name="_Toc235983595"/>
+      <w:bookmarkStart w:id="92" w:name="_Toc236342135"/>
       <w:r>
         <w:rPr>
           <w:rFonts w:ascii="Times New Roman" w:eastAsia="Times New Roman" w:hAnsi="Times New Roman" w:cs="Times New Roman"/>
@@ -35789,7 +35760,7 @@
           <w:szCs w:val="24"/>
         </w:rPr>
       </w:pPr>
-      <w:bookmarkStart w:id="93" w:name="_Toc235983596"/>
+      <w:bookmarkStart w:id="93" w:name="_Toc236342136"/>
       <w:r>
         <w:rPr>
           <w:rFonts w:ascii="Times New Roman" w:eastAsia="Times New Roman" w:hAnsi="Times New Roman" w:cs="Times New Roman"/>
@@ -36104,7 +36075,7 @@
           <w:szCs w:val="24"/>
         </w:rPr>
       </w:pPr>
-      <w:bookmarkStart w:id="95" w:name="_Toc235983597"/>
+      <w:bookmarkStart w:id="95" w:name="_Toc236342137"/>
       <w:r>
         <w:rPr>
           <w:rFonts w:ascii="Times New Roman" w:eastAsia="Times New Roman" w:hAnsi="Times New Roman" w:cs="Times New Roman"/>
@@ -36382,7 +36353,7 @@
           <w:szCs w:val="28"/>
         </w:rPr>
       </w:pPr>
-      <w:bookmarkStart w:id="96" w:name="_Toc235983598"/>
+      <w:bookmarkStart w:id="96" w:name="_Toc236342138"/>
       <w:r>
         <w:rPr>
           <w:rFonts w:ascii="Times New Roman" w:eastAsia="Times New Roman" w:hAnsi="Times New Roman" w:cs="Times New Roman"/>
@@ -36404,7 +36375,7 @@
           <w:szCs w:val="24"/>
         </w:rPr>
       </w:pPr>
-      <w:bookmarkStart w:id="97" w:name="_Toc235983599"/>
+      <w:bookmarkStart w:id="97" w:name="_Toc236342139"/>
       <w:r>
         <w:rPr>
           <w:rFonts w:ascii="Times New Roman" w:eastAsia="Times New Roman" w:hAnsi="Times New Roman" w:cs="Times New Roman"/>
@@ -36567,7 +36538,7 @@
           <w:szCs w:val="24"/>
         </w:rPr>
       </w:pPr>
-      <w:bookmarkStart w:id="98" w:name="_Toc235983600"/>
+      <w:bookmarkStart w:id="98" w:name="_Toc236342140"/>
       <w:r>
         <w:rPr>
           <w:rFonts w:ascii="Times New Roman" w:eastAsia="Times New Roman" w:hAnsi="Times New Roman" w:cs="Times New Roman"/>
@@ -37699,7 +37670,7 @@
           <w:szCs w:val="28"/>
         </w:rPr>
       </w:pPr>
-      <w:bookmarkStart w:id="99" w:name="_Toc235983601"/>
+      <w:bookmarkStart w:id="99" w:name="_Toc236342141"/>
       <w:r>
         <w:rPr>
           <w:rFonts w:ascii="Times New Roman" w:eastAsia="Times New Roman" w:hAnsi="Times New Roman" w:cs="Times New Roman"/>
@@ -37732,7 +37703,7 @@
           <w:szCs w:val="24"/>
         </w:rPr>
       </w:pPr>
-      <w:bookmarkStart w:id="100" w:name="_Toc235983602"/>
+      <w:bookmarkStart w:id="100" w:name="_Toc236342142"/>
       <w:r>
         <w:rPr>
           <w:rFonts w:ascii="Times New Roman" w:hAnsi="Times New Roman" w:cs="Times New Roman"/>
@@ -38258,7 +38229,7 @@
           <w:szCs w:val="24"/>
         </w:rPr>
       </w:pPr>
-      <w:bookmarkStart w:id="102" w:name="_Toc235983603"/>
+      <w:bookmarkStart w:id="102" w:name="_Toc236342143"/>
       <w:r>
         <w:rPr>
           <w:rFonts w:ascii="Times New Roman" w:eastAsia="Times New Roman" w:hAnsi="Times New Roman" w:cs="Times New Roman"/>
@@ -38348,7 +38319,7 @@
           <w:szCs w:val="28"/>
         </w:rPr>
       </w:pPr>
-      <w:bookmarkStart w:id="103" w:name="_Toc235983604"/>
+      <w:bookmarkStart w:id="103" w:name="_Toc236342144"/>
       <w:r>
         <w:rPr>
           <w:rFonts w:ascii="Times New Roman" w:eastAsia="Times New Roman" w:hAnsi="Times New Roman" w:cs="Times New Roman"/>
@@ -40042,7 +40013,7 @@
           <w:lang w:val="en-US"/>
         </w:rPr>
       </w:pPr>
-      <w:bookmarkStart w:id="106" w:name="_Toc235983605"/>
+      <w:bookmarkStart w:id="106" w:name="_Toc236342145"/>
       <w:r>
         <w:rPr>
           <w:rFonts w:ascii="Times New Roman" w:hAnsi="Times New Roman" w:cs="Times New Roman"/>
@@ -40267,7 +40238,7 @@
           <w:szCs w:val="32"/>
         </w:rPr>
       </w:pPr>
-      <w:bookmarkStart w:id="107" w:name="_Toc235983606"/>
+      <w:bookmarkStart w:id="107" w:name="_Toc236342146"/>
       <w:r>
         <w:rPr>
           <w:rFonts w:eastAsiaTheme="majorEastAsia"/>
@@ -40281,6 +40252,7 @@
     <w:p>
       <w:pPr>
         <w:pStyle w:val="Heading2"/>
+        <w:spacing w:line="480" w:lineRule="auto"/>
         <w:rPr>
           <w:rFonts w:ascii="Times New Roman" w:hAnsi="Times New Roman" w:cs="Times New Roman"/>
           <w:sz w:val="28"/>
@@ -40288,7 +40260,7 @@
           <w:lang w:val="en-US"/>
         </w:rPr>
       </w:pPr>
-      <w:bookmarkStart w:id="108" w:name="_Toc235983607"/>
+      <w:bookmarkStart w:id="108" w:name="_Toc236342147"/>
       <w:r>
         <w:rPr>
           <w:rFonts w:ascii="Times New Roman" w:hAnsi="Times New Roman" w:cs="Times New Roman"/>
@@ -40305,11 +40277,15 @@
         <w:spacing w:after="0" w:line="480" w:lineRule="auto"/>
         <w:jc w:val="both"/>
         <w:rPr>
-          <w:lang w:val="en-US"/>
-        </w:rPr>
-      </w:pPr>
-      <w:r>
-        <w:rPr>
+          <w:sz w:val="24"/>
+          <w:szCs w:val="24"/>
+          <w:lang w:val="en-US"/>
+        </w:rPr>
+      </w:pPr>
+      <w:r>
+        <w:rPr>
+          <w:sz w:val="24"/>
+          <w:szCs w:val="24"/>
           <w:lang w:val="en-US"/>
         </w:rPr>
         <w:t>This chapter evaluates the proposed Regulatory Guardian platform to assess its effectiveness, functionality, and practical applicability in banking compliance scenarios. The evaluation is structured into three parts:</w:t>
@@ -40325,17 +40301,23 @@
         <w:spacing w:after="0" w:line="480" w:lineRule="auto"/>
         <w:jc w:val="both"/>
         <w:rPr>
-          <w:lang w:val="en-US"/>
-        </w:rPr>
-      </w:pPr>
-      <w:r>
-        <w:rPr>
+          <w:sz w:val="24"/>
+          <w:szCs w:val="24"/>
+          <w:lang w:val="en-US"/>
+        </w:rPr>
+      </w:pPr>
+      <w:r>
+        <w:rPr>
+          <w:sz w:val="24"/>
+          <w:szCs w:val="24"/>
           <w:lang w:val="en-US"/>
         </w:rPr>
         <w:t>Functional Evaluation – Demonstrates end</w:t>
       </w:r>
       <w:r>
         <w:rPr>
+          <w:sz w:val="24"/>
+          <w:szCs w:val="24"/>
           <w:lang w:val="en-US"/>
         </w:rPr>
         <w:noBreakHyphen/>
@@ -40343,6 +40325,8 @@
       </w:r>
       <w:r>
         <w:rPr>
+          <w:sz w:val="24"/>
+          <w:szCs w:val="24"/>
           <w:lang w:val="en-US"/>
         </w:rPr>
         <w:noBreakHyphen/>
@@ -40359,17 +40343,23 @@
         <w:spacing w:after="0" w:line="480" w:lineRule="auto"/>
         <w:jc w:val="both"/>
         <w:rPr>
-          <w:lang w:val="en-US"/>
-        </w:rPr>
-      </w:pPr>
-      <w:r>
-        <w:rPr>
+          <w:sz w:val="24"/>
+          <w:szCs w:val="24"/>
+          <w:lang w:val="en-US"/>
+        </w:rPr>
+      </w:pPr>
+      <w:r>
+        <w:rPr>
+          <w:sz w:val="24"/>
+          <w:szCs w:val="24"/>
           <w:lang w:val="en-US"/>
         </w:rPr>
         <w:t>AI Model Evaluation – Assesses LegalBERT fine</w:t>
       </w:r>
       <w:r>
         <w:rPr>
+          <w:sz w:val="24"/>
+          <w:szCs w:val="24"/>
           <w:lang w:val="en-US"/>
         </w:rPr>
         <w:noBreakHyphen/>
@@ -40386,11 +40376,15 @@
         <w:spacing w:after="0" w:line="480" w:lineRule="auto"/>
         <w:jc w:val="both"/>
         <w:rPr>
-          <w:lang w:val="en-US"/>
-        </w:rPr>
-      </w:pPr>
-      <w:r>
-        <w:rPr>
+          <w:sz w:val="24"/>
+          <w:szCs w:val="24"/>
+          <w:lang w:val="en-US"/>
+        </w:rPr>
+      </w:pPr>
+      <w:r>
+        <w:rPr>
+          <w:sz w:val="24"/>
+          <w:szCs w:val="24"/>
           <w:lang w:val="en-US"/>
         </w:rPr>
         <w:t>Comparative &amp; Performance Analysis – Ablation study, baseline comparison, and system performance metrics.</w:t>
@@ -40401,11 +40395,15 @@
         <w:spacing w:after="0" w:line="480" w:lineRule="auto"/>
         <w:jc w:val="both"/>
         <w:rPr>
-          <w:lang w:val="en-US"/>
-        </w:rPr>
-      </w:pPr>
-      <w:r>
-        <w:rPr>
+          <w:sz w:val="24"/>
+          <w:szCs w:val="24"/>
+          <w:lang w:val="en-US"/>
+        </w:rPr>
+      </w:pPr>
+      <w:r>
+        <w:rPr>
+          <w:sz w:val="24"/>
+          <w:szCs w:val="24"/>
           <w:lang w:val="en-US"/>
         </w:rPr>
         <w:t>The experiments use publicly available benchmarks (CUAD, DocLayNet) and realistic banking contracts to validate accuracy, transparency, and operational readiness.</w:t>
@@ -40422,7 +40420,7 @@
           <w:lang w:val="en-US"/>
         </w:rPr>
       </w:pPr>
-      <w:bookmarkStart w:id="109" w:name="_Toc235983608"/>
+      <w:bookmarkStart w:id="109" w:name="_Toc236342148"/>
       <w:r>
         <w:rPr>
           <w:rFonts w:ascii="Times New Roman" w:hAnsi="Times New Roman" w:cs="Times New Roman"/>
@@ -41074,7 +41072,7 @@
           <w:lang w:val="en-US"/>
         </w:rPr>
       </w:pPr>
-      <w:bookmarkStart w:id="111" w:name="_Toc235983609"/>
+      <w:bookmarkStart w:id="111" w:name="_Toc236342149"/>
       <w:r>
         <w:rPr>
           <w:rFonts w:ascii="Times New Roman" w:hAnsi="Times New Roman" w:cs="Times New Roman"/>
@@ -41098,7 +41096,7 @@
           <w:lang w:val="en-US"/>
         </w:rPr>
       </w:pPr>
-      <w:bookmarkStart w:id="112" w:name="_Toc235983610"/>
+      <w:bookmarkStart w:id="112" w:name="_Toc236342150"/>
       <w:r>
         <w:rPr>
           <w:rFonts w:ascii="Times New Roman" w:hAnsi="Times New Roman" w:cs="Times New Roman"/>
@@ -41543,7 +41541,7 @@
           <w:lang w:val="en-US"/>
         </w:rPr>
       </w:pPr>
-      <w:bookmarkStart w:id="115" w:name="_Toc235983611"/>
+      <w:bookmarkStart w:id="115" w:name="_Toc236342151"/>
       <w:r>
         <w:rPr>
           <w:rFonts w:ascii="Times New Roman" w:hAnsi="Times New Roman" w:cs="Times New Roman"/>
@@ -41976,7 +41974,7 @@
           <w:lang w:val="en-US"/>
         </w:rPr>
       </w:pPr>
-      <w:bookmarkStart w:id="118" w:name="_Toc235983612"/>
+      <w:bookmarkStart w:id="118" w:name="_Toc236342152"/>
       <w:r>
         <w:rPr>
           <w:rFonts w:ascii="Times New Roman" w:hAnsi="Times New Roman" w:cs="Times New Roman"/>
@@ -42330,7 +42328,7 @@
           <w:lang w:val="en-US"/>
         </w:rPr>
       </w:pPr>
-      <w:bookmarkStart w:id="120" w:name="_Toc235983613"/>
+      <w:bookmarkStart w:id="120" w:name="_Toc236342153"/>
       <w:r>
         <w:rPr>
           <w:rFonts w:ascii="Times New Roman" w:hAnsi="Times New Roman" w:cs="Times New Roman"/>
@@ -42354,7 +42352,7 @@
           <w:lang w:val="en-US"/>
         </w:rPr>
       </w:pPr>
-      <w:bookmarkStart w:id="121" w:name="_Toc235983614"/>
+      <w:bookmarkStart w:id="121" w:name="_Toc236342154"/>
       <w:r>
         <w:rPr>
           <w:rFonts w:ascii="Times New Roman" w:hAnsi="Times New Roman" w:cs="Times New Roman"/>
@@ -44036,7 +44034,7 @@
           <w:lang w:val="en-US"/>
         </w:rPr>
       </w:pPr>
-      <w:bookmarkStart w:id="126" w:name="_Toc235983615"/>
+      <w:bookmarkStart w:id="126" w:name="_Toc236342155"/>
       <w:r>
         <w:rPr>
           <w:rFonts w:ascii="Times New Roman" w:hAnsi="Times New Roman" w:cs="Times New Roman"/>
@@ -44605,7 +44603,7 @@
           <w:lang w:val="en-US"/>
         </w:rPr>
       </w:pPr>
-      <w:bookmarkStart w:id="128" w:name="_Toc235983616"/>
+      <w:bookmarkStart w:id="128" w:name="_Toc236342156"/>
       <w:r>
         <w:rPr>
           <w:rFonts w:ascii="Times New Roman" w:hAnsi="Times New Roman" w:cs="Times New Roman"/>
@@ -47333,7 +47331,7 @@
           <w:lang w:val="en-US"/>
         </w:rPr>
       </w:pPr>
-      <w:bookmarkStart w:id="131" w:name="_Toc235983617"/>
+      <w:bookmarkStart w:id="131" w:name="_Toc236342157"/>
       <w:r>
         <w:rPr>
           <w:rFonts w:ascii="Times New Roman" w:hAnsi="Times New Roman" w:cs="Times New Roman"/>
@@ -47419,7 +47417,7 @@
           <w:lang w:val="en-US"/>
         </w:rPr>
       </w:pPr>
-      <w:bookmarkStart w:id="132" w:name="_Toc235983618"/>
+      <w:bookmarkStart w:id="132" w:name="_Toc236342158"/>
       <w:r>
         <w:rPr>
           <w:rFonts w:ascii="Times New Roman" w:hAnsi="Times New Roman" w:cs="Times New Roman"/>
@@ -47818,7 +47816,7 @@
           <w:szCs w:val="32"/>
         </w:rPr>
       </w:pPr>
-      <w:bookmarkStart w:id="133" w:name="_Toc235983619"/>
+      <w:bookmarkStart w:id="133" w:name="_Toc236342159"/>
       <w:r>
         <w:rPr>
           <w:sz w:val="32"/>
@@ -47840,7 +47838,7 @@
           <w:lang w:val="en-US"/>
         </w:rPr>
       </w:pPr>
-      <w:bookmarkStart w:id="134" w:name="_Toc235983620"/>
+      <w:bookmarkStart w:id="134" w:name="_Toc236342160"/>
       <w:r>
         <w:rPr>
           <w:rFonts w:ascii="Times New Roman" w:hAnsi="Times New Roman" w:cs="Times New Roman"/>
@@ -47887,7 +47885,7 @@
           <w:lang w:val="en-US"/>
         </w:rPr>
       </w:pPr>
-      <w:bookmarkStart w:id="135" w:name="_Toc235983621"/>
+      <w:bookmarkStart w:id="135" w:name="_Toc236342161"/>
       <w:r>
         <w:rPr>
           <w:rFonts w:ascii="Times New Roman" w:hAnsi="Times New Roman" w:cs="Times New Roman"/>
@@ -48707,7 +48705,7 @@
           <w:lang w:val="en-US"/>
         </w:rPr>
       </w:pPr>
-      <w:bookmarkStart w:id="137" w:name="_Toc235983622"/>
+      <w:bookmarkStart w:id="137" w:name="_Toc236342162"/>
       <w:r>
         <w:rPr>
           <w:rFonts w:ascii="Times New Roman" w:hAnsi="Times New Roman" w:cs="Times New Roman"/>
@@ -49598,7 +49596,7 @@
           <w:lang w:val="en-US"/>
         </w:rPr>
       </w:pPr>
-      <w:bookmarkStart w:id="138" w:name="_Toc235983623"/>
+      <w:bookmarkStart w:id="138" w:name="_Toc236342163"/>
       <w:r>
         <w:rPr>
           <w:rFonts w:ascii="Times New Roman" w:hAnsi="Times New Roman" w:cs="Times New Roman"/>
@@ -50415,7 +50413,7 @@
           <w:lang w:val="en-US"/>
         </w:rPr>
       </w:pPr>
-      <w:bookmarkStart w:id="140" w:name="_Toc235983624"/>
+      <w:bookmarkStart w:id="140" w:name="_Toc236342164"/>
       <w:r>
         <w:rPr>
           <w:rFonts w:ascii="Times New Roman" w:hAnsi="Times New Roman" w:cs="Times New Roman"/>
@@ -50439,7 +50437,7 @@
           <w:lang w:val="en-US"/>
         </w:rPr>
       </w:pPr>
-      <w:bookmarkStart w:id="141" w:name="_Toc235983625"/>
+      <w:bookmarkStart w:id="141" w:name="_Toc236342165"/>
       <w:r>
         <w:rPr>
           <w:rFonts w:ascii="Times New Roman" w:hAnsi="Times New Roman" w:cs="Times New Roman"/>
@@ -50497,7 +50495,7 @@
           <w:lang w:val="en-US"/>
         </w:rPr>
       </w:pPr>
-      <w:bookmarkStart w:id="142" w:name="_Toc235983626"/>
+      <w:bookmarkStart w:id="142" w:name="_Toc236342166"/>
       <w:r>
         <w:rPr>
           <w:rFonts w:ascii="Times New Roman" w:hAnsi="Times New Roman" w:cs="Times New Roman"/>
@@ -50544,7 +50542,7 @@
           <w:lang w:val="en-US"/>
         </w:rPr>
       </w:pPr>
-      <w:bookmarkStart w:id="143" w:name="_Toc235983627"/>
+      <w:bookmarkStart w:id="143" w:name="_Toc236342167"/>
       <w:r>
         <w:rPr>
           <w:rFonts w:ascii="Times New Roman" w:hAnsi="Times New Roman" w:cs="Times New Roman"/>
@@ -50603,7 +50601,7 @@
           <w:lang w:val="en-US"/>
         </w:rPr>
       </w:pPr>
-      <w:bookmarkStart w:id="144" w:name="_Toc235983628"/>
+      <w:bookmarkStart w:id="144" w:name="_Toc236342168"/>
       <w:r>
         <w:rPr>
           <w:rFonts w:ascii="Times New Roman" w:hAnsi="Times New Roman" w:cs="Times New Roman"/>
@@ -50787,7 +50785,7 @@
           <w:lang w:val="en-US"/>
         </w:rPr>
       </w:pPr>
-      <w:bookmarkStart w:id="145" w:name="_Toc235983629"/>
+      <w:bookmarkStart w:id="145" w:name="_Toc236342169"/>
       <w:r>
         <w:rPr>
           <w:rFonts w:ascii="Times New Roman" w:hAnsi="Times New Roman" w:cs="Times New Roman"/>
@@ -50834,7 +50832,7 @@
           <w:lang w:val="en-US"/>
         </w:rPr>
       </w:pPr>
-      <w:bookmarkStart w:id="146" w:name="_Toc235983630"/>
+      <w:bookmarkStart w:id="146" w:name="_Toc236342170"/>
       <w:r>
         <w:rPr>
           <w:rFonts w:ascii="Times New Roman" w:hAnsi="Times New Roman" w:cs="Times New Roman"/>
@@ -50881,7 +50879,7 @@
           <w:lang w:val="en-US"/>
         </w:rPr>
       </w:pPr>
-      <w:bookmarkStart w:id="147" w:name="_Toc235983631"/>
+      <w:bookmarkStart w:id="147" w:name="_Toc236342171"/>
       <w:r>
         <w:rPr>
           <w:rFonts w:ascii="Times New Roman" w:hAnsi="Times New Roman" w:cs="Times New Roman"/>
@@ -51138,7 +51136,7 @@
           <w:lang w:val="en-US"/>
         </w:rPr>
       </w:pPr>
-      <w:bookmarkStart w:id="148" w:name="_Toc235983632"/>
+      <w:bookmarkStart w:id="148" w:name="_Toc236342172"/>
       <w:r>
         <w:rPr>
           <w:rFonts w:ascii="Times New Roman" w:hAnsi="Times New Roman" w:cs="Times New Roman"/>
@@ -51713,7 +51711,7 @@
           <w:szCs w:val="32"/>
         </w:rPr>
       </w:pPr>
-      <w:bookmarkStart w:id="149" w:name="_Toc235983633"/>
+      <w:bookmarkStart w:id="149" w:name="_Toc236342173"/>
       <w:r>
         <w:rPr>
           <w:sz w:val="32"/>
@@ -51731,7 +51729,7 @@
           <w:szCs w:val="32"/>
         </w:rPr>
       </w:pPr>
-      <w:bookmarkStart w:id="150" w:name="_Toc235983634"/>
+      <w:bookmarkStart w:id="150" w:name="_Toc236342174"/>
       <w:r>
         <w:rPr>
           <w:sz w:val="24"/>
@@ -53501,7 +53499,7 @@
           <w:szCs w:val="32"/>
         </w:rPr>
       </w:pPr>
-      <w:bookmarkStart w:id="151" w:name="_Toc235983635"/>
+      <w:bookmarkStart w:id="151" w:name="_Toc236342175"/>
       <w:r>
         <w:rPr>
           <w:sz w:val="32"/>
@@ -54530,35 +54528,27 @@
     </w:p>
     <w:p>
       <w:pPr>
-        <w:spacing w:after="0" w:line="240" w:lineRule="auto"/>
         <w:jc w:val="center"/>
-        <w:outlineLvl w:val="0"/>
-        <w:rPr>
-          <w:rFonts w:eastAsia="Times New Roman" w:cs="Times New Roman"/>
+        <w:rPr>
           <w:b/>
-          <w:bCs/>
           <w:kern w:val="36"/>
-          <w:sz w:val="48"/>
-          <w:szCs w:val="48"/>
-          <w:lang w:val="en-US"/>
-        </w:rPr>
-      </w:pPr>
-      <w:bookmarkStart w:id="152" w:name="_Toc235983636"/>
-      <w:r>
-        <w:rPr>
-          <w:rFonts w:ascii="Verdana" w:eastAsia="Times New Roman" w:hAnsi="Verdana" w:cs="Times New Roman"/>
+          <w:sz w:val="24"/>
+          <w:szCs w:val="24"/>
+          <w:u w:val="single"/>
+          <w:lang w:val="en-US"/>
+        </w:rPr>
+      </w:pPr>
+      <w:r>
+        <w:rPr>
           <w:b/>
-          <w:bCs/>
-          <w:color w:val="000000"/>
           <w:kern w:val="36"/>
-          <w:sz w:val="20"/>
-          <w:szCs w:val="20"/>
+          <w:sz w:val="24"/>
+          <w:szCs w:val="24"/>
           <w:u w:val="single"/>
           <w:lang w:val="en-US"/>
         </w:rPr>
         <w:t>Checklist of Items for the Final Dissertation / Project / Project Work Report</w:t>
       </w:r>
-      <w:bookmarkEnd w:id="152"/>
     </w:p>
     <w:p>
       <w:pPr>
@@ -60874,6 +60864,7 @@
   <w:style w:type="character" w:default="1" w:styleId="DefaultParagraphFont">
     <w:name w:val="Default Paragraph Font"/>
     <w:uiPriority w:val="1"/>
+    <w:semiHidden/>
     <w:unhideWhenUsed/>
   </w:style>
   <w:style w:type="table" w:default="1" w:styleId="TableNormal">
@@ -61784,7 +61775,7 @@
   <a:extraClrSchemeLst/>
   <a:extLst>
     <a:ext uri="{05A4C25C-085E-4340-85A3-A5531E510DB2}">
-      <thm15:themeFamily xmlns:thm15="http://schemas.microsoft.com/office/thememl/2012/main" xmlns="" name="Office Theme" id="{62F939B6-93AF-4DB8-9C6B-D6C7DFDC589F}" vid="{4A3C46E8-61CC-4603-A589-7422A47A8E4A}"/>
+      <thm15:themeFamily xmlns="" xmlns:thm15="http://schemas.microsoft.com/office/thememl/2012/main" name="Office Theme" id="{62F939B6-93AF-4DB8-9C6B-D6C7DFDC589F}" vid="{4A3C46E8-61CC-4603-A589-7422A47A8E4A}"/>
     </a:ext>
   </a:extLst>
 </a:theme>
@@ -61795,7 +61786,7 @@
 </file>
 
 <file path=customXml/itemProps1.xml><?xml version="1.0" encoding="utf-8"?>
-<ds:datastoreItem xmlns:ds="http://schemas.openxmlformats.org/officeDocument/2006/customXml" ds:itemID="{C56B631F-460B-4717-9ABB-0AF5AB528CD6}">
+<ds:datastoreItem xmlns:ds="http://schemas.openxmlformats.org/officeDocument/2006/customXml" ds:itemID="{38D36120-9830-4AB7-A99E-86FE002A5D0A}">
   <ds:schemaRefs>
     <ds:schemaRef ds:uri="http://schemas.openxmlformats.org/officeDocument/2006/bibliography"/>
   </ds:schemaRefs>

</xml_diff>